<commit_message>
Think about how derivations need to change when temp affects other parameters or maybe even non-lineaerly as it's not the same exactly
</commit_message>
<xml_diff>
--- a/ms/supplement.docx
+++ b/ms/supplement.docx
@@ -42,7 +42,7 @@
         <w:t xml:space="preserve">2026-05-05</w:t>
       </w:r>
     </w:p>
-    <w:bookmarkStart w:id="62" w:name="a-tutorial-with-simulations"/>
+    <w:bookmarkStart w:id="68" w:name="a-tutorial-with-simulations"/>
     <w:p>
       <w:pPr>
         <w:pStyle w:val="Heading1"/>
@@ -18849,22 +18849,3895 @@
       </w:r>
     </w:p>
     <w:bookmarkEnd w:id="57"/>
-    <w:bookmarkStart w:id="61" w:name="sec-compare"/>
+    <w:bookmarkStart w:id="63" w:name="sec-joint-extend"/>
     <w:p>
       <w:pPr>
         <w:pStyle w:val="Heading3"/>
       </w:pPr>
       <w:r>
-        <w:t xml:space="preserve">1.0.5 Comparing the two pipelines</w:t>
+        <w:t xml:space="preserve">1.0.5 Extending the model: smooth or temperature-varying parameters</w:t>
       </w:r>
     </w:p>
-    <w:bookmarkStart w:id="59" w:name="sec-compare-table"/>
+    <w:p>
+      <w:pPr>
+        <w:pStyle w:val="FirstParagraph"/>
+      </w:pPr>
+      <w:r>
+        <w:t xml:space="preserve">The closed-form derivations of</w:t>
+      </w:r>
+      <w:r>
+        <w:t xml:space="preserve"> </w:t>
+      </w:r>
+      <m:oMath>
+        <m:r>
+          <m:t>z</m:t>
+        </m:r>
+      </m:oMath>
+      <w:r>
+        <w:t xml:space="preserve"> </w:t>
+      </w:r>
+      <w:r>
+        <w:t xml:space="preserve">and</w:t>
+      </w:r>
+      <w:r>
+        <w:t xml:space="preserve"> </w:t>
+      </w:r>
+      <m:oMath>
+        <m:r>
+          <m:t>C</m:t>
+        </m:r>
+        <m:sSub>
+          <m:e>
+            <m:r>
+              <m:t>T</m:t>
+            </m:r>
+          </m:e>
+          <m:sub>
+            <m:r>
+              <m:t>m</m:t>
+            </m:r>
+            <m:r>
+              <m:t>a</m:t>
+            </m:r>
+            <m:sSub>
+              <m:e>
+                <m:r>
+                  <m:t>x</m:t>
+                </m:r>
+              </m:e>
+              <m:sub>
+                <m:r>
+                  <m:t>1</m:t>
+                </m:r>
+                <m:r>
+                  <m:t>h</m:t>
+                </m:r>
+                <m:r>
+                  <m:t>r</m:t>
+                </m:r>
+              </m:sub>
+            </m:sSub>
+          </m:sub>
+        </m:sSub>
+      </m:oMath>
+      <w:r>
+        <w:t xml:space="preserve"> </w:t>
+      </w:r>
+      <w:r>
+        <w:t xml:space="preserve">rely on two assumptions:</w:t>
+      </w:r>
+    </w:p>
+    <w:p>
+      <w:pPr>
+        <w:pStyle w:val="Compact"/>
+        <w:numPr>
+          <w:ilvl w:val="0"/>
+          <w:numId w:val="1002"/>
+        </w:numPr>
+      </w:pPr>
+      <w:r>
+        <w:rPr>
+          <w:rStyle w:val="VerbatimChar"/>
+          <w:b/>
+          <w:bCs/>
+        </w:rPr>
+        <w:t xml:space="preserve">mid(T)</w:t>
+      </w:r>
+      <w:r>
+        <w:rPr>
+          <w:b/>
+          <w:bCs/>
+        </w:rPr>
+        <w:t xml:space="preserve"> </w:t>
+      </w:r>
+      <w:r>
+        <w:rPr>
+          <w:b/>
+          <w:bCs/>
+        </w:rPr>
+        <w:t xml:space="preserve">is linear in T</w:t>
+      </w:r>
+      <w:r>
+        <w:t xml:space="preserve">, so a single slope</w:t>
+      </w:r>
+      <w:r>
+        <w:t xml:space="preserve"> </w:t>
+      </w:r>
+      <m:oMath>
+        <m:sSub>
+          <m:e>
+            <m:r>
+              <m:t>β</m:t>
+            </m:r>
+          </m:e>
+          <m:sub>
+            <m:r>
+              <m:t>1</m:t>
+            </m:r>
+          </m:sub>
+        </m:sSub>
+      </m:oMath>
+      <w:r>
+        <w:t xml:space="preserve"> </w:t>
+      </w:r>
+      <w:r>
+        <w:t xml:space="preserve">defines</w:t>
+      </w:r>
+      <w:r>
+        <w:t xml:space="preserve"> </w:t>
+      </w:r>
+      <m:oMath>
+        <m:r>
+          <m:t>z</m:t>
+        </m:r>
+        <m:r>
+          <m:rPr>
+            <m:sty m:val="p"/>
+          </m:rPr>
+          <m:t>=</m:t>
+        </m:r>
+        <m:r>
+          <m:rPr>
+            <m:sty m:val="p"/>
+          </m:rPr>
+          <m:t>−</m:t>
+        </m:r>
+        <m:r>
+          <m:t>1</m:t>
+        </m:r>
+        <m:r>
+          <m:rPr>
+            <m:sty m:val="p"/>
+          </m:rPr>
+          <m:t>/</m:t>
+        </m:r>
+        <m:sSub>
+          <m:e>
+            <m:r>
+              <m:t>β</m:t>
+            </m:r>
+          </m:e>
+          <m:sub>
+            <m:r>
+              <m:t>1</m:t>
+            </m:r>
+          </m:sub>
+        </m:sSub>
+      </m:oMath>
+      <w:r>
+        <w:t xml:space="preserve">.</w:t>
+      </w:r>
+    </w:p>
+    <w:p>
+      <w:pPr>
+        <w:pStyle w:val="Compact"/>
+        <w:numPr>
+          <w:ilvl w:val="0"/>
+          <w:numId w:val="1002"/>
+        </w:numPr>
+      </w:pPr>
+      <m:oMath>
+        <m:r>
+          <m:rPr>
+            <m:sty m:val="p"/>
+          </m:rPr>
+          <m:t>ℓ</m:t>
+        </m:r>
+        <m:r>
+          <m:rPr>
+            <m:sty m:val="p"/>
+          </m:rPr>
+          <m:t>,</m:t>
+        </m:r>
+        <m:r>
+          <m:t>u</m:t>
+        </m:r>
+      </m:oMath>
+      <w:r>
+        <w:rPr>
+          <w:b/>
+          <w:bCs/>
+        </w:rPr>
+        <w:t xml:space="preserve"> </w:t>
+      </w:r>
+      <w:r>
+        <w:rPr>
+          <w:b/>
+          <w:bCs/>
+        </w:rPr>
+        <w:t xml:space="preserve">and</w:t>
+      </w:r>
+      <w:r>
+        <w:rPr>
+          <w:b/>
+          <w:bCs/>
+        </w:rPr>
+        <w:t xml:space="preserve"> </w:t>
+      </w:r>
+      <m:oMath>
+        <m:r>
+          <m:t>k</m:t>
+        </m:r>
+      </m:oMath>
+      <w:r>
+        <w:rPr>
+          <w:b/>
+          <w:bCs/>
+        </w:rPr>
+        <w:t xml:space="preserve"> </w:t>
+      </w:r>
+      <w:r>
+        <w:rPr>
+          <w:b/>
+          <w:bCs/>
+        </w:rPr>
+        <w:t xml:space="preserve">are scalars</w:t>
+      </w:r>
+      <w:r>
+        <w:t xml:space="preserve"> </w:t>
+      </w:r>
+      <w:r>
+        <w:t xml:space="preserve">(do not depend on</w:t>
+      </w:r>
+      <w:r>
+        <w:t xml:space="preserve"> </w:t>
+      </w:r>
+      <m:oMath>
+        <m:r>
+          <m:t>T</m:t>
+        </m:r>
+      </m:oMath>
+      <w:r>
+        <w:t xml:space="preserve">), so the asymmetry correction</w:t>
+      </w:r>
+      <w:r>
+        <w:t xml:space="preserve"> </w:t>
+      </w:r>
+      <m:oMath>
+        <m:f>
+          <m:fPr>
+            <m:type m:val="lin"/>
+          </m:fPr>
+          <m:num>
+            <m:r>
+              <m:t>1</m:t>
+            </m:r>
+          </m:num>
+          <m:den>
+            <m:r>
+              <m:t>k</m:t>
+            </m:r>
+          </m:den>
+        </m:f>
+        <m:r>
+          <m:rPr>
+            <m:sty m:val="p"/>
+          </m:rPr>
+          <m:t>log</m:t>
+        </m:r>
+        <m:f>
+          <m:fPr>
+            <m:type m:val="lin"/>
+          </m:fPr>
+          <m:num>
+            <m:r>
+              <m:t>u</m:t>
+            </m:r>
+            <m:r>
+              <m:rPr>
+                <m:sty m:val="p"/>
+              </m:rPr>
+              <m:t>−</m:t>
+            </m:r>
+            <m:r>
+              <m:t>0.5</m:t>
+            </m:r>
+          </m:num>
+          <m:den>
+            <m:r>
+              <m:t>0.5</m:t>
+            </m:r>
+            <m:r>
+              <m:rPr>
+                <m:sty m:val="p"/>
+              </m:rPr>
+              <m:t>−</m:t>
+            </m:r>
+            <m:r>
+              <m:rPr>
+                <m:sty m:val="p"/>
+              </m:rPr>
+              <m:t>ℓ</m:t>
+            </m:r>
+          </m:den>
+        </m:f>
+      </m:oMath>
+      <w:r>
+        <w:t xml:space="preserve"> </w:t>
+      </w:r>
+      <w:r>
+        <w:t xml:space="preserve">is a single number rather than a function of temperature.</w:t>
+      </w:r>
+    </w:p>
+    <w:p>
+      <w:pPr>
+        <w:pStyle w:val="FirstParagraph"/>
+      </w:pPr>
+      <w:r>
+        <w:t xml:space="preserve">Both assumptions are convenient but neither is required. Relax either and the framework still works — the closed-form expressions become</w:t>
+      </w:r>
+      <w:r>
+        <w:t xml:space="preserve"> </w:t>
+      </w:r>
+      <w:r>
+        <w:rPr>
+          <w:i/>
+          <w:iCs/>
+        </w:rPr>
+        <w:t xml:space="preserve">functional</w:t>
+      </w:r>
+      <w:r>
+        <w:t xml:space="preserve">, and we recover</w:t>
+      </w:r>
+      <w:r>
+        <w:t xml:space="preserve"> </w:t>
+      </w:r>
+      <m:oMath>
+        <m:r>
+          <m:t>z</m:t>
+        </m:r>
+      </m:oMath>
+      <w:r>
+        <w:t xml:space="preserve"> </w:t>
+      </w:r>
+      <w:r>
+        <w:t xml:space="preserve">and</w:t>
+      </w:r>
+      <w:r>
+        <w:t xml:space="preserve"> </w:t>
+      </w:r>
+      <m:oMath>
+        <m:r>
+          <m:t>C</m:t>
+        </m:r>
+        <m:sSub>
+          <m:e>
+            <m:r>
+              <m:t>T</m:t>
+            </m:r>
+          </m:e>
+          <m:sub>
+            <m:r>
+              <m:t>m</m:t>
+            </m:r>
+            <m:r>
+              <m:t>a</m:t>
+            </m:r>
+            <m:sSub>
+              <m:e>
+                <m:r>
+                  <m:t>x</m:t>
+                </m:r>
+              </m:e>
+              <m:sub>
+                <m:r>
+                  <m:t>1</m:t>
+                </m:r>
+                <m:r>
+                  <m:t>h</m:t>
+                </m:r>
+                <m:r>
+                  <m:t>r</m:t>
+                </m:r>
+              </m:sub>
+            </m:sSub>
+          </m:sub>
+        </m:sSub>
+      </m:oMath>
+      <w:r>
+        <w:t xml:space="preserve"> </w:t>
+      </w:r>
+      <w:r>
+        <w:t xml:space="preserve">numerically from each posterior draw rather than algebraically. Below we walk through the two practical cases.</w:t>
+      </w:r>
+    </w:p>
+    <w:bookmarkStart w:id="59" w:name="sec-joint-extend-smooth"/>
     <w:p>
       <w:pPr>
         <w:pStyle w:val="Heading4"/>
       </w:pPr>
       <w:r>
-        <w:t xml:space="preserve">1.0.5.1 Point-estimate agreement on the same data</w:t>
+        <w:t xml:space="preserve">1.0.5.1 Case 1 — smooth</w:t>
+      </w:r>
+      <w:r>
+        <w:t xml:space="preserve"> </w:t>
+      </w:r>
+      <w:r>
+        <w:rPr>
+          <w:rStyle w:val="VerbatimChar"/>
+        </w:rPr>
+        <w:t xml:space="preserve">mid(T)</w:t>
+      </w:r>
+    </w:p>
+    <w:p>
+      <w:pPr>
+        <w:pStyle w:val="FirstParagraph"/>
+      </w:pPr>
+      <w:r>
+        <w:t xml:space="preserve">Replacing</w:t>
+      </w:r>
+      <w:r>
+        <w:t xml:space="preserve"> </w:t>
+      </w:r>
+      <w:r>
+        <w:rPr>
+          <w:rStyle w:val="VerbatimChar"/>
+        </w:rPr>
+        <w:t xml:space="preserve">mid ~ T_c</w:t>
+      </w:r>
+      <w:r>
+        <w:t xml:space="preserve"> </w:t>
+      </w:r>
+      <w:r>
+        <w:t xml:space="preserve">in the</w:t>
+      </w:r>
+      <w:r>
+        <w:t xml:space="preserve"> </w:t>
+      </w:r>
+      <w:r>
+        <w:rPr>
+          <w:rStyle w:val="VerbatimChar"/>
+        </w:rPr>
+        <w:t xml:space="preserve">bf()</w:t>
+      </w:r>
+      <w:r>
+        <w:t xml:space="preserve"> </w:t>
+      </w:r>
+      <w:r>
+        <w:t xml:space="preserve">formula with a polynomial (e.g. </w:t>
+      </w:r>
+      <w:r>
+        <w:rPr>
+          <w:rStyle w:val="VerbatimChar"/>
+        </w:rPr>
+        <w:t xml:space="preserve">mid ~ poly(T_c, 2)</w:t>
+      </w:r>
+      <w:r>
+        <w:t xml:space="preserve">) or a smooth (e.g. </w:t>
+      </w:r>
+      <w:r>
+        <w:rPr>
+          <w:rStyle w:val="VerbatimChar"/>
+        </w:rPr>
+        <w:t xml:space="preserve">mid ~ s(T_c)</w:t>
+      </w:r>
+      <w:r>
+        <w:t xml:space="preserve">) lets the midpoint shift non-linearly with assay temperature. Keeping</w:t>
+      </w:r>
+      <w:r>
+        <w:t xml:space="preserve"> </w:t>
+      </w:r>
+      <m:oMath>
+        <m:r>
+          <m:rPr>
+            <m:sty m:val="p"/>
+          </m:rPr>
+          <m:t>ℓ</m:t>
+        </m:r>
+        <m:r>
+          <m:rPr>
+            <m:sty m:val="p"/>
+          </m:rPr>
+          <m:t>,</m:t>
+        </m:r>
+        <m:r>
+          <m:t>u</m:t>
+        </m:r>
+        <m:r>
+          <m:rPr>
+            <m:sty m:val="p"/>
+          </m:rPr>
+          <m:t>,</m:t>
+        </m:r>
+        <m:r>
+          <m:t>k</m:t>
+        </m:r>
+      </m:oMath>
+      <w:r>
+        <w:t xml:space="preserve"> </w:t>
+      </w:r>
+      <w:r>
+        <w:t xml:space="preserve">as scalars, the TDT relation becomes</w:t>
+      </w:r>
+    </w:p>
+    <w:p>
+      <w:pPr>
+        <w:pStyle w:val="BodyText"/>
+      </w:pPr>
+      <w:bookmarkStart w:id="58" w:name="eq-lt50-smooth"/>
+      <m:oMathPara>
+        <m:oMathParaPr>
+          <m:jc m:val="center"/>
+        </m:oMathParaPr>
+        <m:oMath>
+          <m:sSub>
+            <m:e>
+              <m:r>
+                <m:rPr>
+                  <m:sty m:val="p"/>
+                </m:rPr>
+                <m:t>log</m:t>
+              </m:r>
+            </m:e>
+            <m:sub>
+              <m:r>
+                <m:t>10</m:t>
+              </m:r>
+            </m:sub>
+          </m:sSub>
+          <m:r>
+            <m:rPr>
+              <m:nor/>
+              <m:sty m:val="p"/>
+            </m:rPr>
+            <m:t>LT50</m:t>
+          </m:r>
+          <m:d>
+            <m:dPr>
+              <m:begChr m:val="("/>
+              <m:sepChr m:val=""/>
+              <m:endChr m:val=")"/>
+              <m:grow/>
+            </m:dPr>
+            <m:e>
+              <m:r>
+                <m:t>T</m:t>
+              </m:r>
+            </m:e>
+          </m:d>
+          <m:r>
+            <m:t> </m:t>
+          </m:r>
+          <m:r>
+            <m:rPr>
+              <m:sty m:val="p"/>
+            </m:rPr>
+            <m:t>=</m:t>
+          </m:r>
+          <m:r>
+            <m:t> </m:t>
+          </m:r>
+          <m:r>
+            <m:rPr>
+              <m:nor/>
+              <m:sty m:val="p"/>
+            </m:rPr>
+            <m:t>mid</m:t>
+          </m:r>
+          <m:d>
+            <m:dPr>
+              <m:begChr m:val="("/>
+              <m:sepChr m:val=""/>
+              <m:endChr m:val=")"/>
+              <m:grow/>
+            </m:dPr>
+            <m:e>
+              <m:r>
+                <m:t>T</m:t>
+              </m:r>
+            </m:e>
+          </m:d>
+          <m:r>
+            <m:t> </m:t>
+          </m:r>
+          <m:r>
+            <m:rPr>
+              <m:sty m:val="p"/>
+            </m:rPr>
+            <m:t>+</m:t>
+          </m:r>
+          <m:r>
+            <m:t> </m:t>
+          </m:r>
+          <m:f>
+            <m:fPr>
+              <m:type m:val="lin"/>
+            </m:fPr>
+            <m:num>
+              <m:r>
+                <m:t>1</m:t>
+              </m:r>
+            </m:num>
+            <m:den>
+              <m:r>
+                <m:t>k</m:t>
+              </m:r>
+            </m:den>
+          </m:f>
+          <m:r>
+            <m:rPr>
+              <m:sty m:val="p"/>
+            </m:rPr>
+            <m:t>log</m:t>
+          </m:r>
+          <m:r>
+            <m:t>​</m:t>
+          </m:r>
+          <m:f>
+            <m:fPr>
+              <m:type m:val="lin"/>
+            </m:fPr>
+            <m:num>
+              <m:r>
+                <m:t>u</m:t>
+              </m:r>
+              <m:r>
+                <m:rPr>
+                  <m:sty m:val="p"/>
+                </m:rPr>
+                <m:t>−</m:t>
+              </m:r>
+              <m:r>
+                <m:t>0.5</m:t>
+              </m:r>
+            </m:num>
+            <m:den>
+              <m:r>
+                <m:t>0.5</m:t>
+              </m:r>
+              <m:r>
+                <m:rPr>
+                  <m:sty m:val="p"/>
+                </m:rPr>
+                <m:t>−</m:t>
+              </m:r>
+              <m:r>
+                <m:rPr>
+                  <m:sty m:val="p"/>
+                </m:rPr>
+                <m:t>ℓ</m:t>
+              </m:r>
+            </m:den>
+          </m:f>
+          <m:r>
+            <m:rPr>
+              <m:sty m:val="p"/>
+            </m:rPr>
+            <m:t>,</m:t>
+          </m:r>
+          <m:r>
+            <m:t>  </m:t>
+          </m:r>
+          <m:d>
+            <m:dPr>
+              <m:begChr m:val="("/>
+              <m:sepChr m:val=""/>
+              <m:endChr m:val=")"/>
+              <m:grow/>
+            </m:dPr>
+            <m:e>
+              <m:r>
+                <m:t>3</m:t>
+              </m:r>
+            </m:e>
+          </m:d>
+        </m:oMath>
+      </m:oMathPara>
+      <w:bookmarkEnd w:id="58"/>
+    </w:p>
+    <w:p>
+      <w:pPr>
+        <w:pStyle w:val="FirstParagraph"/>
+      </w:pPr>
+      <w:r>
+        <w:t xml:space="preserve">which is no longer linear in</w:t>
+      </w:r>
+      <w:r>
+        <w:t xml:space="preserve"> </w:t>
+      </w:r>
+      <m:oMath>
+        <m:r>
+          <m:t>T</m:t>
+        </m:r>
+      </m:oMath>
+      <w:r>
+        <w:t xml:space="preserve">. Two consequences follow:</w:t>
+      </w:r>
+    </w:p>
+    <w:p>
+      <w:pPr>
+        <w:pStyle w:val="Compact"/>
+        <w:numPr>
+          <w:ilvl w:val="0"/>
+          <w:numId w:val="1003"/>
+        </w:numPr>
+      </w:pPr>
+      <m:oMath>
+        <m:r>
+          <m:t>z</m:t>
+        </m:r>
+      </m:oMath>
+      <w:r>
+        <w:rPr>
+          <w:b/>
+          <w:bCs/>
+        </w:rPr>
+        <w:t xml:space="preserve"> </w:t>
+      </w:r>
+      <w:r>
+        <w:rPr>
+          <w:b/>
+          <w:bCs/>
+        </w:rPr>
+        <w:t xml:space="preserve">becomes a function of temperature.</w:t>
+      </w:r>
+      <w:r>
+        <w:t xml:space="preserve"> </w:t>
+      </w:r>
+      <w:r>
+        <w:t xml:space="preserve">Since</w:t>
+      </w:r>
+      <w:r>
+        <w:t xml:space="preserve"> </w:t>
+      </w:r>
+      <m:oMath>
+        <m:r>
+          <m:t>z</m:t>
+        </m:r>
+      </m:oMath>
+      <w:r>
+        <w:t xml:space="preserve"> </w:t>
+      </w:r>
+      <w:r>
+        <w:t xml:space="preserve">is defined by the local rate of change of</w:t>
+      </w:r>
+      <w:r>
+        <w:t xml:space="preserve"> </w:t>
+      </w:r>
+      <m:oMath>
+        <m:sSub>
+          <m:e>
+            <m:r>
+              <m:rPr>
+                <m:sty m:val="p"/>
+              </m:rPr>
+              <m:t>log</m:t>
+            </m:r>
+          </m:e>
+          <m:sub>
+            <m:r>
+              <m:t>10</m:t>
+            </m:r>
+          </m:sub>
+        </m:sSub>
+        <m:r>
+          <m:rPr>
+            <m:nor/>
+            <m:sty m:val="p"/>
+          </m:rPr>
+          <m:t>LT50</m:t>
+        </m:r>
+      </m:oMath>
+      <w:r>
+        <w:t xml:space="preserve"> </w:t>
+      </w:r>
+      <w:r>
+        <w:t xml:space="preserve">with</w:t>
+      </w:r>
+      <w:r>
+        <w:t xml:space="preserve"> </w:t>
+      </w:r>
+      <m:oMath>
+        <m:r>
+          <m:t>T</m:t>
+        </m:r>
+      </m:oMath>
+      <w:r>
+        <w:t xml:space="preserve">,</w:t>
+      </w:r>
+      <w:r>
+        <w:t xml:space="preserve"> </w:t>
+      </w:r>
+      <m:oMath>
+        <m:r>
+          <m:t>z</m:t>
+        </m:r>
+        <m:d>
+          <m:dPr>
+            <m:begChr m:val="("/>
+            <m:sepChr m:val=""/>
+            <m:endChr m:val=")"/>
+            <m:grow/>
+          </m:dPr>
+          <m:e>
+            <m:r>
+              <m:t>T</m:t>
+            </m:r>
+          </m:e>
+        </m:d>
+        <m:r>
+          <m:rPr>
+            <m:sty m:val="p"/>
+          </m:rPr>
+          <m:t>=</m:t>
+        </m:r>
+        <m:r>
+          <m:rPr>
+            <m:sty m:val="p"/>
+          </m:rPr>
+          <m:t>−</m:t>
+        </m:r>
+        <m:r>
+          <m:t>1</m:t>
+        </m:r>
+        <m:r>
+          <m:rPr>
+            <m:sty m:val="p"/>
+          </m:rPr>
+          <m:t>/</m:t>
+        </m:r>
+        <m:f>
+          <m:fPr>
+            <m:type m:val="lin"/>
+          </m:fPr>
+          <m:num>
+            <m:r>
+              <m:t>d</m:t>
+            </m:r>
+            <m:r>
+              <m:t> </m:t>
+            </m:r>
+            <m:r>
+              <m:rPr>
+                <m:nor/>
+                <m:sty m:val="p"/>
+              </m:rPr>
+              <m:t>mid</m:t>
+            </m:r>
+            <m:d>
+              <m:dPr>
+                <m:begChr m:val="("/>
+                <m:sepChr m:val=""/>
+                <m:endChr m:val=")"/>
+                <m:grow/>
+              </m:dPr>
+              <m:e>
+                <m:r>
+                  <m:t>T</m:t>
+                </m:r>
+              </m:e>
+            </m:d>
+          </m:num>
+          <m:den>
+            <m:r>
+              <m:t>d</m:t>
+            </m:r>
+            <m:r>
+              <m:t>T</m:t>
+            </m:r>
+          </m:den>
+        </m:f>
+      </m:oMath>
+      <w:r>
+        <w:t xml:space="preserve">. We either report</w:t>
+      </w:r>
+      <w:r>
+        <w:t xml:space="preserve"> </w:t>
+      </w:r>
+      <m:oMath>
+        <m:r>
+          <m:t>z</m:t>
+        </m:r>
+      </m:oMath>
+      <w:r>
+        <w:t xml:space="preserve"> </w:t>
+      </w:r>
+      <w:r>
+        <w:t xml:space="preserve">at one or more reference temperatures (e.g. the midpoint of the assay range), or as a curve</w:t>
+      </w:r>
+      <w:r>
+        <w:t xml:space="preserve"> </w:t>
+      </w:r>
+      <m:oMath>
+        <m:r>
+          <m:t>z</m:t>
+        </m:r>
+        <m:d>
+          <m:dPr>
+            <m:begChr m:val="("/>
+            <m:sepChr m:val=""/>
+            <m:endChr m:val=")"/>
+            <m:grow/>
+          </m:dPr>
+          <m:e>
+            <m:r>
+              <m:t>T</m:t>
+            </m:r>
+          </m:e>
+        </m:d>
+      </m:oMath>
+      <w:r>
+        <w:t xml:space="preserve"> </w:t>
+      </w:r>
+      <w:r>
+        <w:t xml:space="preserve">with credible bands. The classical</w:t>
+      </w:r>
+      <w:r>
+        <w:t xml:space="preserve"> </w:t>
+      </w:r>
+      <w:r>
+        <w:t xml:space="preserve">“single</w:t>
+      </w:r>
+      <w:r>
+        <w:t xml:space="preserve"> </w:t>
+      </w:r>
+      <m:oMath>
+        <m:r>
+          <m:t>z</m:t>
+        </m:r>
+      </m:oMath>
+      <w:r>
+        <w:t xml:space="preserve"> </w:t>
+      </w:r>
+      <w:r>
+        <w:t xml:space="preserve">per species”</w:t>
+      </w:r>
+      <w:r>
+        <w:t xml:space="preserve"> </w:t>
+      </w:r>
+      <w:r>
+        <w:t xml:space="preserve">loses its meaning when the underlying relationship isn’t linear — and when it does, that itself is a useful biological diagnostic.</w:t>
+      </w:r>
+    </w:p>
+    <w:p>
+      <w:pPr>
+        <w:pStyle w:val="Compact"/>
+        <w:numPr>
+          <w:ilvl w:val="0"/>
+          <w:numId w:val="1003"/>
+        </w:numPr>
+      </w:pPr>
+      <m:oMath>
+        <m:r>
+          <m:t>C</m:t>
+        </m:r>
+        <m:sSub>
+          <m:e>
+            <m:r>
+              <m:t>T</m:t>
+            </m:r>
+          </m:e>
+          <m:sub>
+            <m:r>
+              <m:t>m</m:t>
+            </m:r>
+            <m:r>
+              <m:t>a</m:t>
+            </m:r>
+            <m:r>
+              <m:t>x</m:t>
+            </m:r>
+          </m:sub>
+        </m:sSub>
+      </m:oMath>
+      <w:r>
+        <w:rPr>
+          <w:b/>
+          <w:bCs/>
+        </w:rPr>
+        <w:t xml:space="preserve"> </w:t>
+      </w:r>
+      <w:r>
+        <w:rPr>
+          <w:b/>
+          <w:bCs/>
+        </w:rPr>
+        <w:t xml:space="preserve">has no closed form.</w:t>
+      </w:r>
+      <w:r>
+        <w:t xml:space="preserve"> </w:t>
+      </w:r>
+      <w:r>
+        <w:t xml:space="preserve">Solve</w:t>
+      </w:r>
+      <w:r>
+        <w:t xml:space="preserve"> </w:t>
+      </w:r>
+      <m:oMath>
+        <m:sSub>
+          <m:e>
+            <m:r>
+              <m:rPr>
+                <m:sty m:val="p"/>
+              </m:rPr>
+              <m:t>log</m:t>
+            </m:r>
+          </m:e>
+          <m:sub>
+            <m:r>
+              <m:t>10</m:t>
+            </m:r>
+          </m:sub>
+        </m:sSub>
+        <m:r>
+          <m:rPr>
+            <m:nor/>
+            <m:sty m:val="p"/>
+          </m:rPr>
+          <m:t>LT50</m:t>
+        </m:r>
+        <m:d>
+          <m:dPr>
+            <m:begChr m:val="("/>
+            <m:sepChr m:val=""/>
+            <m:endChr m:val=")"/>
+            <m:grow/>
+          </m:dPr>
+          <m:e>
+            <m:r>
+              <m:t>T</m:t>
+            </m:r>
+          </m:e>
+        </m:d>
+        <m:r>
+          <m:rPr>
+            <m:sty m:val="p"/>
+          </m:rPr>
+          <m:t>=</m:t>
+        </m:r>
+        <m:sSub>
+          <m:e>
+            <m:r>
+              <m:rPr>
+                <m:sty m:val="p"/>
+              </m:rPr>
+              <m:t>log</m:t>
+            </m:r>
+          </m:e>
+          <m:sub>
+            <m:r>
+              <m:t>10</m:t>
+            </m:r>
+          </m:sub>
+        </m:sSub>
+        <m:sSub>
+          <m:e>
+            <m:r>
+              <m:t>t</m:t>
+            </m:r>
+          </m:e>
+          <m:sub>
+            <m:r>
+              <m:rPr>
+                <m:nor/>
+                <m:sty m:val="p"/>
+              </m:rPr>
+              <m:t>ref</m:t>
+            </m:r>
+          </m:sub>
+        </m:sSub>
+      </m:oMath>
+      <w:r>
+        <w:t xml:space="preserve"> </w:t>
+      </w:r>
+      <w:r>
+        <w:t xml:space="preserve">for</w:t>
+      </w:r>
+      <w:r>
+        <w:t xml:space="preserve"> </w:t>
+      </w:r>
+      <m:oMath>
+        <m:r>
+          <m:t>T</m:t>
+        </m:r>
+      </m:oMath>
+      <w:r>
+        <w:t xml:space="preserve"> </w:t>
+      </w:r>
+      <w:r>
+        <w:t xml:space="preserve">per posterior draw, e.g. with</w:t>
+      </w:r>
+      <w:r>
+        <w:t xml:space="preserve"> </w:t>
+      </w:r>
+      <w:r>
+        <w:rPr>
+          <w:rStyle w:val="VerbatimChar"/>
+        </w:rPr>
+        <w:t xml:space="preserve">uniroot()</w:t>
+      </w:r>
+      <w:r>
+        <w:t xml:space="preserve"> </w:t>
+      </w:r>
+      <w:r>
+        <w:t xml:space="preserve">over the assay temperature range. The output is the same kind of posterior we already have — produced numerically.</w:t>
+      </w:r>
+    </w:p>
+    <w:bookmarkEnd w:id="59"/>
+    <w:bookmarkStart w:id="61" w:name="sec-joint-extend-tvarying"/>
+    <w:p>
+      <w:pPr>
+        <w:pStyle w:val="Heading4"/>
+      </w:pPr>
+      <w:r>
+        <w:t xml:space="preserve">1.0.5.2 Case 2 — temperature affects</w:t>
+      </w:r>
+      <w:r>
+        <w:t xml:space="preserve"> </w:t>
+      </w:r>
+      <m:oMath>
+        <m:r>
+          <m:rPr>
+            <m:sty m:val="p"/>
+          </m:rPr>
+          <m:t>ℓ</m:t>
+        </m:r>
+      </m:oMath>
+      <w:r>
+        <w:t xml:space="preserve">,</w:t>
+      </w:r>
+      <w:r>
+        <w:t xml:space="preserve"> </w:t>
+      </w:r>
+      <m:oMath>
+        <m:r>
+          <m:t>u</m:t>
+        </m:r>
+      </m:oMath>
+      <w:r>
+        <w:t xml:space="preserve">, or</w:t>
+      </w:r>
+      <w:r>
+        <w:t xml:space="preserve"> </w:t>
+      </w:r>
+      <m:oMath>
+        <m:r>
+          <m:t>k</m:t>
+        </m:r>
+      </m:oMath>
+    </w:p>
+    <w:p>
+      <w:pPr>
+        <w:pStyle w:val="FirstParagraph"/>
+      </w:pPr>
+      <w:r>
+        <w:t xml:space="preserve">If any of the shape parameters depends on temperature — for instance</w:t>
+      </w:r>
+      <w:r>
+        <w:t xml:space="preserve"> </w:t>
+      </w:r>
+      <w:r>
+        <w:rPr>
+          <w:rStyle w:val="VerbatimChar"/>
+        </w:rPr>
+        <w:t xml:space="preserve">k ~ T_c</w:t>
+      </w:r>
+      <w:r>
+        <w:t xml:space="preserve">, which lets the dose-response steepness change with assay temperature — the asymmetry correction itself becomes a function of</w:t>
+      </w:r>
+      <w:r>
+        <w:t xml:space="preserve"> </w:t>
+      </w:r>
+      <m:oMath>
+        <m:r>
+          <m:t>T</m:t>
+        </m:r>
+      </m:oMath>
+      <w:r>
+        <w:t xml:space="preserve">:</w:t>
+      </w:r>
+    </w:p>
+    <w:p>
+      <w:pPr>
+        <w:pStyle w:val="BodyText"/>
+      </w:pPr>
+      <w:bookmarkStart w:id="60" w:name="eq-lt50-tvarying"/>
+      <m:oMathPara>
+        <m:oMathParaPr>
+          <m:jc m:val="center"/>
+        </m:oMathParaPr>
+        <m:oMath>
+          <m:sSub>
+            <m:e>
+              <m:r>
+                <m:rPr>
+                  <m:sty m:val="p"/>
+                </m:rPr>
+                <m:t>log</m:t>
+              </m:r>
+            </m:e>
+            <m:sub>
+              <m:r>
+                <m:t>10</m:t>
+              </m:r>
+            </m:sub>
+          </m:sSub>
+          <m:r>
+            <m:rPr>
+              <m:nor/>
+              <m:sty m:val="p"/>
+            </m:rPr>
+            <m:t>LT50</m:t>
+          </m:r>
+          <m:d>
+            <m:dPr>
+              <m:begChr m:val="("/>
+              <m:sepChr m:val=""/>
+              <m:endChr m:val=")"/>
+              <m:grow/>
+            </m:dPr>
+            <m:e>
+              <m:r>
+                <m:t>T</m:t>
+              </m:r>
+            </m:e>
+          </m:d>
+          <m:r>
+            <m:t> </m:t>
+          </m:r>
+          <m:r>
+            <m:rPr>
+              <m:sty m:val="p"/>
+            </m:rPr>
+            <m:t>=</m:t>
+          </m:r>
+          <m:r>
+            <m:t> </m:t>
+          </m:r>
+          <m:r>
+            <m:rPr>
+              <m:nor/>
+              <m:sty m:val="p"/>
+            </m:rPr>
+            <m:t>mid</m:t>
+          </m:r>
+          <m:d>
+            <m:dPr>
+              <m:begChr m:val="("/>
+              <m:sepChr m:val=""/>
+              <m:endChr m:val=")"/>
+              <m:grow/>
+            </m:dPr>
+            <m:e>
+              <m:r>
+                <m:t>T</m:t>
+              </m:r>
+            </m:e>
+          </m:d>
+          <m:r>
+            <m:t> </m:t>
+          </m:r>
+          <m:r>
+            <m:rPr>
+              <m:sty m:val="p"/>
+            </m:rPr>
+            <m:t>+</m:t>
+          </m:r>
+          <m:r>
+            <m:t> </m:t>
+          </m:r>
+          <m:f>
+            <m:fPr>
+              <m:type m:val="lin"/>
+            </m:fPr>
+            <m:num>
+              <m:r>
+                <m:t>1</m:t>
+              </m:r>
+            </m:num>
+            <m:den>
+              <m:r>
+                <m:t>k</m:t>
+              </m:r>
+              <m:d>
+                <m:dPr>
+                  <m:begChr m:val="("/>
+                  <m:sepChr m:val=""/>
+                  <m:endChr m:val=")"/>
+                  <m:grow/>
+                </m:dPr>
+                <m:e>
+                  <m:r>
+                    <m:t>T</m:t>
+                  </m:r>
+                </m:e>
+              </m:d>
+            </m:den>
+          </m:f>
+          <m:r>
+            <m:rPr>
+              <m:sty m:val="p"/>
+            </m:rPr>
+            <m:t>log</m:t>
+          </m:r>
+          <m:r>
+            <m:t>​</m:t>
+          </m:r>
+          <m:f>
+            <m:fPr>
+              <m:type m:val="lin"/>
+            </m:fPr>
+            <m:num>
+              <m:r>
+                <m:t>u</m:t>
+              </m:r>
+              <m:d>
+                <m:dPr>
+                  <m:begChr m:val="("/>
+                  <m:sepChr m:val=""/>
+                  <m:endChr m:val=")"/>
+                  <m:grow/>
+                </m:dPr>
+                <m:e>
+                  <m:r>
+                    <m:t>T</m:t>
+                  </m:r>
+                </m:e>
+              </m:d>
+              <m:r>
+                <m:rPr>
+                  <m:sty m:val="p"/>
+                </m:rPr>
+                <m:t>−</m:t>
+              </m:r>
+              <m:r>
+                <m:t>0.5</m:t>
+              </m:r>
+            </m:num>
+            <m:den>
+              <m:r>
+                <m:t>0.5</m:t>
+              </m:r>
+              <m:r>
+                <m:rPr>
+                  <m:sty m:val="p"/>
+                </m:rPr>
+                <m:t>−</m:t>
+              </m:r>
+              <m:r>
+                <m:rPr>
+                  <m:sty m:val="p"/>
+                </m:rPr>
+                <m:t>ℓ</m:t>
+              </m:r>
+              <m:d>
+                <m:dPr>
+                  <m:begChr m:val="("/>
+                  <m:sepChr m:val=""/>
+                  <m:endChr m:val=")"/>
+                  <m:grow/>
+                </m:dPr>
+                <m:e>
+                  <m:r>
+                    <m:t>T</m:t>
+                  </m:r>
+                </m:e>
+              </m:d>
+            </m:den>
+          </m:f>
+          <m:r>
+            <m:rPr>
+              <m:sty m:val="p"/>
+            </m:rPr>
+            <m:t>.</m:t>
+          </m:r>
+          <m:r>
+            <m:t>  </m:t>
+          </m:r>
+          <m:d>
+            <m:dPr>
+              <m:begChr m:val="("/>
+              <m:sepChr m:val=""/>
+              <m:endChr m:val=")"/>
+              <m:grow/>
+            </m:dPr>
+            <m:e>
+              <m:r>
+                <m:t>4</m:t>
+              </m:r>
+            </m:e>
+          </m:d>
+        </m:oMath>
+      </m:oMathPara>
+      <w:bookmarkEnd w:id="60"/>
+    </w:p>
+    <w:p>
+      <w:pPr>
+        <w:pStyle w:val="FirstParagraph"/>
+      </w:pPr>
+      <w:r>
+        <w:t xml:space="preserve">So even if</w:t>
+      </w:r>
+      <w:r>
+        <w:t xml:space="preserve"> </w:t>
+      </w:r>
+      <m:oMath>
+        <m:r>
+          <m:rPr>
+            <m:nor/>
+            <m:sty m:val="p"/>
+          </m:rPr>
+          <m:t>mid</m:t>
+        </m:r>
+        <m:d>
+          <m:dPr>
+            <m:begChr m:val="("/>
+            <m:sepChr m:val=""/>
+            <m:endChr m:val=")"/>
+            <m:grow/>
+          </m:dPr>
+          <m:e>
+            <m:r>
+              <m:t>T</m:t>
+            </m:r>
+          </m:e>
+        </m:d>
+      </m:oMath>
+      <w:r>
+        <w:t xml:space="preserve"> </w:t>
+      </w:r>
+      <w:r>
+        <w:t xml:space="preserve">is linear,</w:t>
+      </w:r>
+      <w:r>
+        <w:t xml:space="preserve"> </w:t>
+      </w:r>
+      <m:oMath>
+        <m:sSub>
+          <m:e>
+            <m:r>
+              <m:rPr>
+                <m:sty m:val="p"/>
+              </m:rPr>
+              <m:t>log</m:t>
+            </m:r>
+          </m:e>
+          <m:sub>
+            <m:r>
+              <m:t>10</m:t>
+            </m:r>
+          </m:sub>
+        </m:sSub>
+        <m:r>
+          <m:rPr>
+            <m:nor/>
+            <m:sty m:val="p"/>
+          </m:rPr>
+          <m:t>LT50</m:t>
+        </m:r>
+        <m:d>
+          <m:dPr>
+            <m:begChr m:val="("/>
+            <m:sepChr m:val=""/>
+            <m:endChr m:val=")"/>
+            <m:grow/>
+          </m:dPr>
+          <m:e>
+            <m:r>
+              <m:t>T</m:t>
+            </m:r>
+          </m:e>
+        </m:d>
+      </m:oMath>
+      <w:r>
+        <w:t xml:space="preserve"> </w:t>
+      </w:r>
+      <w:r>
+        <w:t xml:space="preserve">is non-linear. The same two consequences as Case 1 apply:</w:t>
+      </w:r>
+      <w:r>
+        <w:t xml:space="preserve"> </w:t>
+      </w:r>
+      <m:oMath>
+        <m:r>
+          <m:t>z</m:t>
+        </m:r>
+        <m:d>
+          <m:dPr>
+            <m:begChr m:val="("/>
+            <m:sepChr m:val=""/>
+            <m:endChr m:val=")"/>
+            <m:grow/>
+          </m:dPr>
+          <m:e>
+            <m:r>
+              <m:t>T</m:t>
+            </m:r>
+          </m:e>
+        </m:d>
+      </m:oMath>
+      <w:r>
+        <w:t xml:space="preserve"> </w:t>
+      </w:r>
+      <w:r>
+        <w:t xml:space="preserve">is functional, and</w:t>
+      </w:r>
+      <w:r>
+        <w:t xml:space="preserve"> </w:t>
+      </w:r>
+      <m:oMath>
+        <m:r>
+          <m:t>C</m:t>
+        </m:r>
+        <m:sSub>
+          <m:e>
+            <m:r>
+              <m:t>T</m:t>
+            </m:r>
+          </m:e>
+          <m:sub>
+            <m:r>
+              <m:t>m</m:t>
+            </m:r>
+            <m:r>
+              <m:t>a</m:t>
+            </m:r>
+            <m:r>
+              <m:t>x</m:t>
+            </m:r>
+          </m:sub>
+        </m:sSub>
+      </m:oMath>
+      <w:r>
+        <w:t xml:space="preserve"> </w:t>
+      </w:r>
+      <w:r>
+        <w:t xml:space="preserve">requires</w:t>
+      </w:r>
+      <w:r>
+        <w:t xml:space="preserve"> </w:t>
+      </w:r>
+      <w:r>
+        <w:rPr>
+          <w:rStyle w:val="VerbatimChar"/>
+        </w:rPr>
+        <w:t xml:space="preserve">uniroot()</w:t>
+      </w:r>
+      <w:r>
+        <w:t xml:space="preserve"> </w:t>
+      </w:r>
+      <w:r>
+        <w:t xml:space="preserve">per draw.</w:t>
+      </w:r>
+    </w:p>
+    <w:p>
+      <w:pPr>
+        <w:pStyle w:val="BodyText"/>
+      </w:pPr>
+      <w:r>
+        <w:t xml:space="preserve">Biologically this is interesting because the dose-response steepness</w:t>
+      </w:r>
+      <w:r>
+        <w:t xml:space="preserve"> </w:t>
+      </w:r>
+      <m:oMath>
+        <m:r>
+          <m:t>k</m:t>
+        </m:r>
+      </m:oMath>
+      <w:r>
+        <w:t xml:space="preserve"> </w:t>
+      </w:r>
+      <w:r>
+        <w:t xml:space="preserve">may genuinely vary with temperature — protein denaturation kinetics often look more threshold-like (sharper) near a protein’s melting temperature, for example. The 4PL handles this as a one-line change to</w:t>
+      </w:r>
+      <w:r>
+        <w:t xml:space="preserve"> </w:t>
+      </w:r>
+      <w:r>
+        <w:rPr>
+          <w:rStyle w:val="VerbatimChar"/>
+        </w:rPr>
+        <w:t xml:space="preserve">bf()</w:t>
+      </w:r>
+      <w:r>
+        <w:t xml:space="preserve">; the classical two-stage pipeline cannot, because the symmetric 2PL it uses at Stage 1 forces a single</w:t>
+      </w:r>
+      <w:r>
+        <w:t xml:space="preserve"> </w:t>
+      </w:r>
+      <m:oMath>
+        <m:r>
+          <m:t>k</m:t>
+        </m:r>
+      </m:oMath>
+      <w:r>
+        <w:t xml:space="preserve"> </w:t>
+      </w:r>
+      <w:r>
+        <w:t xml:space="preserve">at every temperature.</w:t>
+      </w:r>
+    </w:p>
+    <w:bookmarkEnd w:id="61"/>
+    <w:bookmarkStart w:id="62" w:name="sec-joint-extend-recipe"/>
+    <w:p>
+      <w:pPr>
+        <w:pStyle w:val="Heading4"/>
+      </w:pPr>
+      <w:r>
+        <w:t xml:space="preserve">1.0.5.3 A general numerical recipe</w:t>
+      </w:r>
+    </w:p>
+    <w:p>
+      <w:pPr>
+        <w:pStyle w:val="FirstParagraph"/>
+      </w:pPr>
+      <w:r>
+        <w:t xml:space="preserve">One workflow handles both cases. For each posterior draw</w:t>
+      </w:r>
+      <w:r>
+        <w:t xml:space="preserve"> </w:t>
+      </w:r>
+      <m:oMath>
+        <m:r>
+          <m:t>θ</m:t>
+        </m:r>
+      </m:oMath>
+      <w:r>
+        <w:t xml:space="preserve">:</w:t>
+      </w:r>
+    </w:p>
+    <w:p>
+      <w:pPr>
+        <w:pStyle w:val="Compact"/>
+        <w:numPr>
+          <w:ilvl w:val="0"/>
+          <w:numId w:val="1004"/>
+        </w:numPr>
+      </w:pPr>
+      <w:r>
+        <w:t xml:space="preserve">Construct a function</w:t>
+      </w:r>
+      <w:r>
+        <w:t xml:space="preserve"> </w:t>
+      </w:r>
+      <m:oMath>
+        <m:sSub>
+          <m:e>
+            <m:r>
+              <m:rPr>
+                <m:sty m:val="p"/>
+              </m:rPr>
+              <m:t>log</m:t>
+            </m:r>
+          </m:e>
+          <m:sub>
+            <m:r>
+              <m:t>10</m:t>
+            </m:r>
+          </m:sub>
+        </m:sSub>
+        <m:r>
+          <m:rPr>
+            <m:nor/>
+            <m:sty m:val="p"/>
+          </m:rPr>
+          <m:t>LT50</m:t>
+        </m:r>
+        <m:d>
+          <m:dPr>
+            <m:begChr m:val="("/>
+            <m:sepChr m:val=""/>
+            <m:endChr m:val=")"/>
+            <m:grow/>
+          </m:dPr>
+          <m:e>
+            <m:r>
+              <m:t>T</m:t>
+            </m:r>
+            <m:r>
+              <m:rPr>
+                <m:sty m:val="p"/>
+              </m:rPr>
+              <m:t>∣</m:t>
+            </m:r>
+            <m:r>
+              <m:t>θ</m:t>
+            </m:r>
+          </m:e>
+        </m:d>
+      </m:oMath>
+      <w:r>
+        <w:t xml:space="preserve"> </w:t>
+      </w:r>
+      <w:r>
+        <w:t xml:space="preserve">using the model’s functional forms for</w:t>
+      </w:r>
+      <w:r>
+        <w:t xml:space="preserve"> </w:t>
+      </w:r>
+      <m:oMath>
+        <m:r>
+          <m:rPr>
+            <m:nor/>
+            <m:sty m:val="p"/>
+          </m:rPr>
+          <m:t>mid</m:t>
+        </m:r>
+        <m:r>
+          <m:rPr>
+            <m:sty m:val="p"/>
+          </m:rPr>
+          <m:t>,</m:t>
+        </m:r>
+        <m:r>
+          <m:rPr>
+            <m:sty m:val="p"/>
+          </m:rPr>
+          <m:t>ℓ</m:t>
+        </m:r>
+        <m:r>
+          <m:rPr>
+            <m:sty m:val="p"/>
+          </m:rPr>
+          <m:t>,</m:t>
+        </m:r>
+        <m:r>
+          <m:t>u</m:t>
+        </m:r>
+        <m:r>
+          <m:rPr>
+            <m:sty m:val="p"/>
+          </m:rPr>
+          <m:t>,</m:t>
+        </m:r>
+        <m:r>
+          <m:t>k</m:t>
+        </m:r>
+      </m:oMath>
+      <w:r>
+        <w:t xml:space="preserve">.</w:t>
+      </w:r>
+    </w:p>
+    <w:p>
+      <w:pPr>
+        <w:pStyle w:val="Compact"/>
+        <w:numPr>
+          <w:ilvl w:val="0"/>
+          <w:numId w:val="1004"/>
+        </w:numPr>
+      </w:pPr>
+      <w:r>
+        <w:t xml:space="preserve">Get the</w:t>
+      </w:r>
+      <w:r>
+        <w:t xml:space="preserve"> </w:t>
+      </w:r>
+      <w:r>
+        <w:rPr>
+          <w:b/>
+          <w:bCs/>
+        </w:rPr>
+        <w:t xml:space="preserve">local</w:t>
+      </w:r>
+      <w:r>
+        <w:rPr>
+          <w:b/>
+          <w:bCs/>
+        </w:rPr>
+        <w:t xml:space="preserve"> </w:t>
+      </w:r>
+      <m:oMath>
+        <m:r>
+          <m:t>z</m:t>
+        </m:r>
+      </m:oMath>
+      <w:r>
+        <w:t xml:space="preserve"> </w:t>
+      </w:r>
+      <w:r>
+        <w:t xml:space="preserve">at any reference temperature by numerical differentiation:</w:t>
+      </w:r>
+      <w:r>
+        <w:t xml:space="preserve"> </w:t>
+      </w:r>
+      <m:oMath>
+        <m:r>
+          <m:t>z</m:t>
+        </m:r>
+        <m:d>
+          <m:dPr>
+            <m:begChr m:val="("/>
+            <m:sepChr m:val=""/>
+            <m:endChr m:val=")"/>
+            <m:grow/>
+          </m:dPr>
+          <m:e>
+            <m:sSub>
+              <m:e>
+                <m:r>
+                  <m:t>T</m:t>
+                </m:r>
+              </m:e>
+              <m:sub>
+                <m:r>
+                  <m:rPr>
+                    <m:nor/>
+                    <m:sty m:val="p"/>
+                  </m:rPr>
+                  <m:t>ref</m:t>
+                </m:r>
+              </m:sub>
+            </m:sSub>
+            <m:r>
+              <m:rPr>
+                <m:sty m:val="p"/>
+              </m:rPr>
+              <m:t>∣</m:t>
+            </m:r>
+            <m:r>
+              <m:t>θ</m:t>
+            </m:r>
+          </m:e>
+        </m:d>
+        <m:r>
+          <m:rPr>
+            <m:sty m:val="p"/>
+          </m:rPr>
+          <m:t>=</m:t>
+        </m:r>
+        <m:r>
+          <m:rPr>
+            <m:sty m:val="p"/>
+          </m:rPr>
+          <m:t>−</m:t>
+        </m:r>
+        <m:r>
+          <m:t>1</m:t>
+        </m:r>
+        <m:r>
+          <m:rPr>
+            <m:sty m:val="p"/>
+          </m:rPr>
+          <m:t>/</m:t>
+        </m:r>
+        <m:sSub>
+          <m:e>
+            <m:r>
+              <m:rPr>
+                <m:sty m:val="p"/>
+              </m:rPr>
+              <m:t>∇</m:t>
+            </m:r>
+          </m:e>
+          <m:sub>
+            <m:r>
+              <m:t>T</m:t>
+            </m:r>
+          </m:sub>
+        </m:sSub>
+        <m:sSub>
+          <m:e>
+            <m:r>
+              <m:rPr>
+                <m:sty m:val="p"/>
+              </m:rPr>
+              <m:t>log</m:t>
+            </m:r>
+          </m:e>
+          <m:sub>
+            <m:r>
+              <m:t>10</m:t>
+            </m:r>
+          </m:sub>
+        </m:sSub>
+        <m:r>
+          <m:rPr>
+            <m:nor/>
+            <m:sty m:val="p"/>
+          </m:rPr>
+          <m:t>LT50</m:t>
+        </m:r>
+        <m:d>
+          <m:dPr>
+            <m:begChr m:val="("/>
+            <m:sepChr m:val=""/>
+            <m:endChr m:val=")"/>
+            <m:grow/>
+          </m:dPr>
+          <m:e>
+            <m:sSub>
+              <m:e>
+                <m:r>
+                  <m:t>T</m:t>
+                </m:r>
+              </m:e>
+              <m:sub>
+                <m:r>
+                  <m:rPr>
+                    <m:nor/>
+                    <m:sty m:val="p"/>
+                  </m:rPr>
+                  <m:t>ref</m:t>
+                </m:r>
+              </m:sub>
+            </m:sSub>
+            <m:r>
+              <m:rPr>
+                <m:sty m:val="p"/>
+              </m:rPr>
+              <m:t>∣</m:t>
+            </m:r>
+            <m:r>
+              <m:t>θ</m:t>
+            </m:r>
+          </m:e>
+        </m:d>
+      </m:oMath>
+      <w:r>
+        <w:t xml:space="preserve">.</w:t>
+      </w:r>
+    </w:p>
+    <w:p>
+      <w:pPr>
+        <w:pStyle w:val="Compact"/>
+        <w:numPr>
+          <w:ilvl w:val="0"/>
+          <w:numId w:val="1004"/>
+        </w:numPr>
+      </w:pPr>
+      <w:r>
+        <w:t xml:space="preserve">Get</w:t>
+      </w:r>
+      <w:r>
+        <w:t xml:space="preserve"> </w:t>
+      </w:r>
+      <m:oMath>
+        <m:r>
+          <m:t>C</m:t>
+        </m:r>
+        <m:sSub>
+          <m:e>
+            <m:r>
+              <m:t>T</m:t>
+            </m:r>
+          </m:e>
+          <m:sub>
+            <m:r>
+              <m:t>m</m:t>
+            </m:r>
+            <m:r>
+              <m:t>a</m:t>
+            </m:r>
+            <m:r>
+              <m:t>x</m:t>
+            </m:r>
+          </m:sub>
+        </m:sSub>
+        <m:d>
+          <m:dPr>
+            <m:begChr m:val="("/>
+            <m:sepChr m:val=""/>
+            <m:endChr m:val=")"/>
+            <m:grow/>
+          </m:dPr>
+          <m:e>
+            <m:sSub>
+              <m:e>
+                <m:r>
+                  <m:t>t</m:t>
+                </m:r>
+              </m:e>
+              <m:sub>
+                <m:r>
+                  <m:rPr>
+                    <m:nor/>
+                    <m:sty m:val="p"/>
+                  </m:rPr>
+                  <m:t>ref</m:t>
+                </m:r>
+              </m:sub>
+            </m:sSub>
+          </m:e>
+        </m:d>
+      </m:oMath>
+      <w:r>
+        <w:t xml:space="preserve"> </w:t>
+      </w:r>
+      <w:r>
+        <w:t xml:space="preserve">by</w:t>
+      </w:r>
+      <w:r>
+        <w:t xml:space="preserve"> </w:t>
+      </w:r>
+      <w:r>
+        <w:rPr>
+          <w:rStyle w:val="VerbatimChar"/>
+        </w:rPr>
+        <w:t xml:space="preserve">uniroot()</w:t>
+      </w:r>
+      <w:r>
+        <w:t xml:space="preserve"> </w:t>
+      </w:r>
+      <w:r>
+        <w:t xml:space="preserve">of</w:t>
+      </w:r>
+      <w:r>
+        <w:t xml:space="preserve"> </w:t>
+      </w:r>
+      <m:oMath>
+        <m:sSub>
+          <m:e>
+            <m:r>
+              <m:rPr>
+                <m:sty m:val="p"/>
+              </m:rPr>
+              <m:t>log</m:t>
+            </m:r>
+          </m:e>
+          <m:sub>
+            <m:r>
+              <m:t>10</m:t>
+            </m:r>
+          </m:sub>
+        </m:sSub>
+        <m:r>
+          <m:rPr>
+            <m:nor/>
+            <m:sty m:val="p"/>
+          </m:rPr>
+          <m:t>LT50</m:t>
+        </m:r>
+        <m:d>
+          <m:dPr>
+            <m:begChr m:val="("/>
+            <m:sepChr m:val=""/>
+            <m:endChr m:val=")"/>
+            <m:grow/>
+          </m:dPr>
+          <m:e>
+            <m:r>
+              <m:t>T</m:t>
+            </m:r>
+            <m:r>
+              <m:rPr>
+                <m:sty m:val="p"/>
+              </m:rPr>
+              <m:t>∣</m:t>
+            </m:r>
+            <m:r>
+              <m:t>θ</m:t>
+            </m:r>
+          </m:e>
+        </m:d>
+        <m:r>
+          <m:rPr>
+            <m:sty m:val="p"/>
+          </m:rPr>
+          <m:t>−</m:t>
+        </m:r>
+        <m:sSub>
+          <m:e>
+            <m:r>
+              <m:rPr>
+                <m:sty m:val="p"/>
+              </m:rPr>
+              <m:t>log</m:t>
+            </m:r>
+          </m:e>
+          <m:sub>
+            <m:r>
+              <m:t>10</m:t>
+            </m:r>
+          </m:sub>
+        </m:sSub>
+        <m:sSub>
+          <m:e>
+            <m:r>
+              <m:t>t</m:t>
+            </m:r>
+          </m:e>
+          <m:sub>
+            <m:r>
+              <m:rPr>
+                <m:nor/>
+                <m:sty m:val="p"/>
+              </m:rPr>
+              <m:t>ref</m:t>
+            </m:r>
+          </m:sub>
+        </m:sSub>
+      </m:oMath>
+      <w:r>
+        <w:t xml:space="preserve"> </w:t>
+      </w:r>
+      <w:r>
+        <w:t xml:space="preserve">over the assay temperature range.</w:t>
+      </w:r>
+    </w:p>
+    <w:p>
+      <w:pPr>
+        <w:pStyle w:val="FirstParagraph"/>
+      </w:pPr>
+      <w:r>
+        <w:t xml:space="preserve">Below is a self-contained helper that implements this. As a sanity check we apply it to one posterior draw of</w:t>
+      </w:r>
+      <w:r>
+        <w:t xml:space="preserve"> </w:t>
+      </w:r>
+      <w:r>
+        <w:rPr>
+          <w:rStyle w:val="VerbatimChar"/>
+        </w:rPr>
+        <w:t xml:space="preserve">fit_bin</w:t>
+      </w:r>
+      <w:r>
+        <w:t xml:space="preserve"> </w:t>
+      </w:r>
+      <w:r>
+        <w:t xml:space="preserve">(which used the linear</w:t>
+      </w:r>
+      <w:r>
+        <w:t xml:space="preserve"> </w:t>
+      </w:r>
+      <w:r>
+        <w:rPr>
+          <w:rStyle w:val="VerbatimChar"/>
+        </w:rPr>
+        <w:t xml:space="preserve">mid ~ T_c</w:t>
+      </w:r>
+      <w:r>
+        <w:t xml:space="preserve"> </w:t>
+      </w:r>
+      <w:r>
+        <w:t xml:space="preserve">from earlier) and compare against the closed-form values.</w:t>
+      </w:r>
+    </w:p>
+    <w:p>
+      <w:pPr>
+        <w:pStyle w:val="SourceCode"/>
+      </w:pPr>
+      <w:r>
+        <w:rPr>
+          <w:rStyle w:val="CommentTok"/>
+        </w:rPr>
+        <w:t xml:space="preserve"># Generic numerical recovery: pass any function of T (one posterior draw).</w:t>
+      </w:r>
+      <w:r>
+        <w:br/>
+      </w:r>
+      <w:r>
+        <w:rPr>
+          <w:rStyle w:val="NormalTok"/>
+        </w:rPr>
+        <w:t xml:space="preserve">recover_tls_numerical </w:t>
+      </w:r>
+      <w:r>
+        <w:rPr>
+          <w:rStyle w:val="OtherTok"/>
+        </w:rPr>
+        <w:t xml:space="preserve">&lt;-</w:t>
+      </w:r>
+      <w:r>
+        <w:rPr>
+          <w:rStyle w:val="NormalTok"/>
+        </w:rPr>
+        <w:t xml:space="preserve"> </w:t>
+      </w:r>
+      <w:r>
+        <w:rPr>
+          <w:rStyle w:val="ControlFlowTok"/>
+        </w:rPr>
+        <w:t xml:space="preserve">function</w:t>
+      </w:r>
+      <w:r>
+        <w:rPr>
+          <w:rStyle w:val="NormalTok"/>
+        </w:rPr>
+        <w:t xml:space="preserve">(log10_lt50_fn,</w:t>
+      </w:r>
+      <w:r>
+        <w:br/>
+      </w:r>
+      <w:r>
+        <w:rPr>
+          <w:rStyle w:val="NormalTok"/>
+        </w:rPr>
+        <w:t xml:space="preserve">                                  </w:t>
+      </w:r>
+      <w:r>
+        <w:rPr>
+          <w:rStyle w:val="AttributeTok"/>
+        </w:rPr>
+        <w:t xml:space="preserve">T_ref     =</w:t>
+      </w:r>
+      <w:r>
+        <w:rPr>
+          <w:rStyle w:val="NormalTok"/>
+        </w:rPr>
+        <w:t xml:space="preserve"> </w:t>
+      </w:r>
+      <w:r>
+        <w:rPr>
+          <w:rStyle w:val="ConstantTok"/>
+        </w:rPr>
+        <w:t xml:space="preserve">NULL</w:t>
+      </w:r>
+      <w:r>
+        <w:rPr>
+          <w:rStyle w:val="NormalTok"/>
+        </w:rPr>
+        <w:t xml:space="preserve">,</w:t>
+      </w:r>
+      <w:r>
+        <w:br/>
+      </w:r>
+      <w:r>
+        <w:rPr>
+          <w:rStyle w:val="NormalTok"/>
+        </w:rPr>
+        <w:t xml:space="preserve">                                  </w:t>
+      </w:r>
+      <w:r>
+        <w:rPr>
+          <w:rStyle w:val="AttributeTok"/>
+        </w:rPr>
+        <w:t xml:space="preserve">t_ref_min =</w:t>
+      </w:r>
+      <w:r>
+        <w:rPr>
+          <w:rStyle w:val="NormalTok"/>
+        </w:rPr>
+        <w:t xml:space="preserve"> </w:t>
+      </w:r>
+      <w:r>
+        <w:rPr>
+          <w:rStyle w:val="DecValTok"/>
+        </w:rPr>
+        <w:t xml:space="preserve">60</w:t>
+      </w:r>
+      <w:r>
+        <w:rPr>
+          <w:rStyle w:val="NormalTok"/>
+        </w:rPr>
+        <w:t xml:space="preserve">,</w:t>
+      </w:r>
+      <w:r>
+        <w:br/>
+      </w:r>
+      <w:r>
+        <w:rPr>
+          <w:rStyle w:val="NormalTok"/>
+        </w:rPr>
+        <w:t xml:space="preserve">                                  </w:t>
+      </w:r>
+      <w:r>
+        <w:rPr>
+          <w:rStyle w:val="AttributeTok"/>
+        </w:rPr>
+        <w:t xml:space="preserve">T_search  =</w:t>
+      </w:r>
+      <w:r>
+        <w:rPr>
+          <w:rStyle w:val="NormalTok"/>
+        </w:rPr>
+        <w:t xml:space="preserve"> </w:t>
+      </w:r>
+      <w:r>
+        <w:rPr>
+          <w:rStyle w:val="FunctionTok"/>
+        </w:rPr>
+        <w:t xml:space="preserve">c</w:t>
+      </w:r>
+      <w:r>
+        <w:rPr>
+          <w:rStyle w:val="NormalTok"/>
+        </w:rPr>
+        <w:t xml:space="preserve">(</w:t>
+      </w:r>
+      <w:r>
+        <w:rPr>
+          <w:rStyle w:val="DecValTok"/>
+        </w:rPr>
+        <w:t xml:space="preserve">20</w:t>
+      </w:r>
+      <w:r>
+        <w:rPr>
+          <w:rStyle w:val="NormalTok"/>
+        </w:rPr>
+        <w:t xml:space="preserve">, </w:t>
+      </w:r>
+      <w:r>
+        <w:rPr>
+          <w:rStyle w:val="DecValTok"/>
+        </w:rPr>
+        <w:t xml:space="preserve">50</w:t>
+      </w:r>
+      <w:r>
+        <w:rPr>
+          <w:rStyle w:val="NormalTok"/>
+        </w:rPr>
+        <w:t xml:space="preserve">)) {</w:t>
+      </w:r>
+      <w:r>
+        <w:br/>
+      </w:r>
+      <w:r>
+        <w:rPr>
+          <w:rStyle w:val="NormalTok"/>
+        </w:rPr>
+        <w:t xml:space="preserve">  out </w:t>
+      </w:r>
+      <w:r>
+        <w:rPr>
+          <w:rStyle w:val="OtherTok"/>
+        </w:rPr>
+        <w:t xml:space="preserve">&lt;-</w:t>
+      </w:r>
+      <w:r>
+        <w:rPr>
+          <w:rStyle w:val="NormalTok"/>
+        </w:rPr>
+        <w:t xml:space="preserve"> </w:t>
+      </w:r>
+      <w:r>
+        <w:rPr>
+          <w:rStyle w:val="FunctionTok"/>
+        </w:rPr>
+        <w:t xml:space="preserve">list</w:t>
+      </w:r>
+      <w:r>
+        <w:rPr>
+          <w:rStyle w:val="NormalTok"/>
+        </w:rPr>
+        <w:t xml:space="preserve">()</w:t>
+      </w:r>
+      <w:r>
+        <w:br/>
+      </w:r>
+      <w:r>
+        <w:rPr>
+          <w:rStyle w:val="NormalTok"/>
+        </w:rPr>
+        <w:t xml:space="preserve">  </w:t>
+      </w:r>
+      <w:r>
+        <w:rPr>
+          <w:rStyle w:val="ControlFlowTok"/>
+        </w:rPr>
+        <w:t xml:space="preserve">if</w:t>
+      </w:r>
+      <w:r>
+        <w:rPr>
+          <w:rStyle w:val="NormalTok"/>
+        </w:rPr>
+        <w:t xml:space="preserve"> (</w:t>
+      </w:r>
+      <w:r>
+        <w:rPr>
+          <w:rStyle w:val="SpecialCharTok"/>
+        </w:rPr>
+        <w:t xml:space="preserve">!</w:t>
+      </w:r>
+      <w:r>
+        <w:rPr>
+          <w:rStyle w:val="FunctionTok"/>
+        </w:rPr>
+        <w:t xml:space="preserve">is.null</w:t>
+      </w:r>
+      <w:r>
+        <w:rPr>
+          <w:rStyle w:val="NormalTok"/>
+        </w:rPr>
+        <w:t xml:space="preserve">(T_ref)) {</w:t>
+      </w:r>
+      <w:r>
+        <w:br/>
+      </w:r>
+      <w:r>
+        <w:rPr>
+          <w:rStyle w:val="NormalTok"/>
+        </w:rPr>
+        <w:t xml:space="preserve">    out</w:t>
+      </w:r>
+      <w:r>
+        <w:rPr>
+          <w:rStyle w:val="SpecialCharTok"/>
+        </w:rPr>
+        <w:t xml:space="preserve">$</w:t>
+      </w:r>
+      <w:r>
+        <w:rPr>
+          <w:rStyle w:val="NormalTok"/>
+        </w:rPr>
+        <w:t xml:space="preserve">z_T </w:t>
+      </w:r>
+      <w:r>
+        <w:rPr>
+          <w:rStyle w:val="OtherTok"/>
+        </w:rPr>
+        <w:t xml:space="preserve">&lt;-</w:t>
+      </w:r>
+      <w:r>
+        <w:rPr>
+          <w:rStyle w:val="NormalTok"/>
+        </w:rPr>
+        <w:t xml:space="preserve"> </w:t>
+      </w:r>
+      <w:r>
+        <w:rPr>
+          <w:rStyle w:val="FunctionTok"/>
+        </w:rPr>
+        <w:t xml:space="preserve">vapply</w:t>
+      </w:r>
+      <w:r>
+        <w:rPr>
+          <w:rStyle w:val="NormalTok"/>
+        </w:rPr>
+        <w:t xml:space="preserve">(T_ref, </w:t>
+      </w:r>
+      <w:r>
+        <w:rPr>
+          <w:rStyle w:val="ControlFlowTok"/>
+        </w:rPr>
+        <w:t xml:space="preserve">function</w:t>
+      </w:r>
+      <w:r>
+        <w:rPr>
+          <w:rStyle w:val="NormalTok"/>
+        </w:rPr>
+        <w:t xml:space="preserve">(Tval) {</w:t>
+      </w:r>
+      <w:r>
+        <w:br/>
+      </w:r>
+      <w:r>
+        <w:rPr>
+          <w:rStyle w:val="NormalTok"/>
+        </w:rPr>
+        <w:t xml:space="preserve">      </w:t>
+      </w:r>
+      <w:r>
+        <w:rPr>
+          <w:rStyle w:val="SpecialCharTok"/>
+        </w:rPr>
+        <w:t xml:space="preserve">-</w:t>
+      </w:r>
+      <w:r>
+        <w:rPr>
+          <w:rStyle w:val="DecValTok"/>
+        </w:rPr>
+        <w:t xml:space="preserve">1</w:t>
+      </w:r>
+      <w:r>
+        <w:rPr>
+          <w:rStyle w:val="NormalTok"/>
+        </w:rPr>
+        <w:t xml:space="preserve"> </w:t>
+      </w:r>
+      <w:r>
+        <w:rPr>
+          <w:rStyle w:val="SpecialCharTok"/>
+        </w:rPr>
+        <w:t xml:space="preserve">/</w:t>
+      </w:r>
+      <w:r>
+        <w:rPr>
+          <w:rStyle w:val="NormalTok"/>
+        </w:rPr>
+        <w:t xml:space="preserve"> numDeriv</w:t>
+      </w:r>
+      <w:r>
+        <w:rPr>
+          <w:rStyle w:val="SpecialCharTok"/>
+        </w:rPr>
+        <w:t xml:space="preserve">::</w:t>
+      </w:r>
+      <w:r>
+        <w:rPr>
+          <w:rStyle w:val="FunctionTok"/>
+        </w:rPr>
+        <w:t xml:space="preserve">grad</w:t>
+      </w:r>
+      <w:r>
+        <w:rPr>
+          <w:rStyle w:val="NormalTok"/>
+        </w:rPr>
+        <w:t xml:space="preserve">(log10_lt50_fn, Tval)</w:t>
+      </w:r>
+      <w:r>
+        <w:br/>
+      </w:r>
+      <w:r>
+        <w:rPr>
+          <w:rStyle w:val="NormalTok"/>
+        </w:rPr>
+        <w:t xml:space="preserve">    }, </w:t>
+      </w:r>
+      <w:r>
+        <w:rPr>
+          <w:rStyle w:val="FunctionTok"/>
+        </w:rPr>
+        <w:t xml:space="preserve">numeric</w:t>
+      </w:r>
+      <w:r>
+        <w:rPr>
+          <w:rStyle w:val="NormalTok"/>
+        </w:rPr>
+        <w:t xml:space="preserve">(</w:t>
+      </w:r>
+      <w:r>
+        <w:rPr>
+          <w:rStyle w:val="DecValTok"/>
+        </w:rPr>
+        <w:t xml:space="preserve">1</w:t>
+      </w:r>
+      <w:r>
+        <w:rPr>
+          <w:rStyle w:val="NormalTok"/>
+        </w:rPr>
+        <w:t xml:space="preserve">))</w:t>
+      </w:r>
+      <w:r>
+        <w:br/>
+      </w:r>
+      <w:r>
+        <w:rPr>
+          <w:rStyle w:val="NormalTok"/>
+        </w:rPr>
+        <w:t xml:space="preserve">    </w:t>
+      </w:r>
+      <w:r>
+        <w:rPr>
+          <w:rStyle w:val="FunctionTok"/>
+        </w:rPr>
+        <w:t xml:space="preserve">names</w:t>
+      </w:r>
+      <w:r>
+        <w:rPr>
+          <w:rStyle w:val="NormalTok"/>
+        </w:rPr>
+        <w:t xml:space="preserve">(out</w:t>
+      </w:r>
+      <w:r>
+        <w:rPr>
+          <w:rStyle w:val="SpecialCharTok"/>
+        </w:rPr>
+        <w:t xml:space="preserve">$</w:t>
+      </w:r>
+      <w:r>
+        <w:rPr>
+          <w:rStyle w:val="NormalTok"/>
+        </w:rPr>
+        <w:t xml:space="preserve">z_T) </w:t>
+      </w:r>
+      <w:r>
+        <w:rPr>
+          <w:rStyle w:val="OtherTok"/>
+        </w:rPr>
+        <w:t xml:space="preserve">&lt;-</w:t>
+      </w:r>
+      <w:r>
+        <w:rPr>
+          <w:rStyle w:val="NormalTok"/>
+        </w:rPr>
+        <w:t xml:space="preserve"> T_ref</w:t>
+      </w:r>
+      <w:r>
+        <w:br/>
+      </w:r>
+      <w:r>
+        <w:rPr>
+          <w:rStyle w:val="NormalTok"/>
+        </w:rPr>
+        <w:t xml:space="preserve">  }</w:t>
+      </w:r>
+      <w:r>
+        <w:br/>
+      </w:r>
+      <w:r>
+        <w:rPr>
+          <w:rStyle w:val="NormalTok"/>
+        </w:rPr>
+        <w:t xml:space="preserve">  out</w:t>
+      </w:r>
+      <w:r>
+        <w:rPr>
+          <w:rStyle w:val="SpecialCharTok"/>
+        </w:rPr>
+        <w:t xml:space="preserve">$</w:t>
+      </w:r>
+      <w:r>
+        <w:rPr>
+          <w:rStyle w:val="NormalTok"/>
+        </w:rPr>
+        <w:t xml:space="preserve">CTmax_1hr </w:t>
+      </w:r>
+      <w:r>
+        <w:rPr>
+          <w:rStyle w:val="OtherTok"/>
+        </w:rPr>
+        <w:t xml:space="preserve">&lt;-</w:t>
+      </w:r>
+      <w:r>
+        <w:rPr>
+          <w:rStyle w:val="NormalTok"/>
+        </w:rPr>
+        <w:t xml:space="preserve"> </w:t>
+      </w:r>
+      <w:r>
+        <w:rPr>
+          <w:rStyle w:val="FunctionTok"/>
+        </w:rPr>
+        <w:t xml:space="preserve">tryCatch</w:t>
+      </w:r>
+      <w:r>
+        <w:rPr>
+          <w:rStyle w:val="NormalTok"/>
+        </w:rPr>
+        <w:t xml:space="preserve">(</w:t>
+      </w:r>
+      <w:r>
+        <w:br/>
+      </w:r>
+      <w:r>
+        <w:rPr>
+          <w:rStyle w:val="NormalTok"/>
+        </w:rPr>
+        <w:t xml:space="preserve">    </w:t>
+      </w:r>
+      <w:r>
+        <w:rPr>
+          <w:rStyle w:val="FunctionTok"/>
+        </w:rPr>
+        <w:t xml:space="preserve">uniroot</w:t>
+      </w:r>
+      <w:r>
+        <w:rPr>
+          <w:rStyle w:val="NormalTok"/>
+        </w:rPr>
+        <w:t xml:space="preserve">(</w:t>
+      </w:r>
+      <w:r>
+        <w:rPr>
+          <w:rStyle w:val="ControlFlowTok"/>
+        </w:rPr>
+        <w:t xml:space="preserve">function</w:t>
+      </w:r>
+      <w:r>
+        <w:rPr>
+          <w:rStyle w:val="NormalTok"/>
+        </w:rPr>
+        <w:t xml:space="preserve">(T) </w:t>
+      </w:r>
+      <w:r>
+        <w:rPr>
+          <w:rStyle w:val="FunctionTok"/>
+        </w:rPr>
+        <w:t xml:space="preserve">log10_lt50_fn</w:t>
+      </w:r>
+      <w:r>
+        <w:rPr>
+          <w:rStyle w:val="NormalTok"/>
+        </w:rPr>
+        <w:t xml:space="preserve">(T) </w:t>
+      </w:r>
+      <w:r>
+        <w:rPr>
+          <w:rStyle w:val="SpecialCharTok"/>
+        </w:rPr>
+        <w:t xml:space="preserve">-</w:t>
+      </w:r>
+      <w:r>
+        <w:rPr>
+          <w:rStyle w:val="NormalTok"/>
+        </w:rPr>
+        <w:t xml:space="preserve"> </w:t>
+      </w:r>
+      <w:r>
+        <w:rPr>
+          <w:rStyle w:val="FunctionTok"/>
+        </w:rPr>
+        <w:t xml:space="preserve">log10</w:t>
+      </w:r>
+      <w:r>
+        <w:rPr>
+          <w:rStyle w:val="NormalTok"/>
+        </w:rPr>
+        <w:t xml:space="preserve">(t_ref_min),</w:t>
+      </w:r>
+      <w:r>
+        <w:br/>
+      </w:r>
+      <w:r>
+        <w:rPr>
+          <w:rStyle w:val="NormalTok"/>
+        </w:rPr>
+        <w:t xml:space="preserve">            </w:t>
+      </w:r>
+      <w:r>
+        <w:rPr>
+          <w:rStyle w:val="AttributeTok"/>
+        </w:rPr>
+        <w:t xml:space="preserve">interval =</w:t>
+      </w:r>
+      <w:r>
+        <w:rPr>
+          <w:rStyle w:val="NormalTok"/>
+        </w:rPr>
+        <w:t xml:space="preserve"> T_search)</w:t>
+      </w:r>
+      <w:r>
+        <w:rPr>
+          <w:rStyle w:val="SpecialCharTok"/>
+        </w:rPr>
+        <w:t xml:space="preserve">$</w:t>
+      </w:r>
+      <w:r>
+        <w:rPr>
+          <w:rStyle w:val="NormalTok"/>
+        </w:rPr>
+        <w:t xml:space="preserve">root,</w:t>
+      </w:r>
+      <w:r>
+        <w:br/>
+      </w:r>
+      <w:r>
+        <w:rPr>
+          <w:rStyle w:val="NormalTok"/>
+        </w:rPr>
+        <w:t xml:space="preserve">    </w:t>
+      </w:r>
+      <w:r>
+        <w:rPr>
+          <w:rStyle w:val="AttributeTok"/>
+        </w:rPr>
+        <w:t xml:space="preserve">error =</w:t>
+      </w:r>
+      <w:r>
+        <w:rPr>
+          <w:rStyle w:val="NormalTok"/>
+        </w:rPr>
+        <w:t xml:space="preserve"> </w:t>
+      </w:r>
+      <w:r>
+        <w:rPr>
+          <w:rStyle w:val="ControlFlowTok"/>
+        </w:rPr>
+        <w:t xml:space="preserve">function</w:t>
+      </w:r>
+      <w:r>
+        <w:rPr>
+          <w:rStyle w:val="NormalTok"/>
+        </w:rPr>
+        <w:t xml:space="preserve">(e) </w:t>
+      </w:r>
+      <w:r>
+        <w:rPr>
+          <w:rStyle w:val="ConstantTok"/>
+        </w:rPr>
+        <w:t xml:space="preserve">NA_real_</w:t>
+      </w:r>
+      <w:r>
+        <w:br/>
+      </w:r>
+      <w:r>
+        <w:rPr>
+          <w:rStyle w:val="NormalTok"/>
+        </w:rPr>
+        <w:t xml:space="preserve">  )</w:t>
+      </w:r>
+      <w:r>
+        <w:br/>
+      </w:r>
+      <w:r>
+        <w:rPr>
+          <w:rStyle w:val="NormalTok"/>
+        </w:rPr>
+        <w:t xml:space="preserve">  out</w:t>
+      </w:r>
+      <w:r>
+        <w:br/>
+      </w:r>
+      <w:r>
+        <w:rPr>
+          <w:rStyle w:val="NormalTok"/>
+        </w:rPr>
+        <w:t xml:space="preserve">}</w:t>
+      </w:r>
+      <w:r>
+        <w:br/>
+      </w:r>
+      <w:r>
+        <w:br/>
+      </w:r>
+      <w:r>
+        <w:rPr>
+          <w:rStyle w:val="CommentTok"/>
+        </w:rPr>
+        <w:t xml:space="preserve"># For the linear-mid model (this fit), build log10_LT50(T) from one draw.</w:t>
+      </w:r>
+      <w:r>
+        <w:br/>
+      </w:r>
+      <w:r>
+        <w:rPr>
+          <w:rStyle w:val="NormalTok"/>
+        </w:rPr>
+        <w:t xml:space="preserve">log10_lt50_from_draw_linear </w:t>
+      </w:r>
+      <w:r>
+        <w:rPr>
+          <w:rStyle w:val="OtherTok"/>
+        </w:rPr>
+        <w:t xml:space="preserve">&lt;-</w:t>
+      </w:r>
+      <w:r>
+        <w:rPr>
+          <w:rStyle w:val="NormalTok"/>
+        </w:rPr>
+        <w:t xml:space="preserve"> </w:t>
+      </w:r>
+      <w:r>
+        <w:rPr>
+          <w:rStyle w:val="ControlFlowTok"/>
+        </w:rPr>
+        <w:t xml:space="preserve">function</w:t>
+      </w:r>
+      <w:r>
+        <w:rPr>
+          <w:rStyle w:val="NormalTok"/>
+        </w:rPr>
+        <w:t xml:space="preserve">(draw, T_bar) {</w:t>
+      </w:r>
+      <w:r>
+        <w:br/>
+      </w:r>
+      <w:r>
+        <w:rPr>
+          <w:rStyle w:val="NormalTok"/>
+        </w:rPr>
+        <w:t xml:space="preserve">  </w:t>
+      </w:r>
+      <w:r>
+        <w:rPr>
+          <w:rStyle w:val="ControlFlowTok"/>
+        </w:rPr>
+        <w:t xml:space="preserve">function</w:t>
+      </w:r>
+      <w:r>
+        <w:rPr>
+          <w:rStyle w:val="NormalTok"/>
+        </w:rPr>
+        <w:t xml:space="preserve">(T) {</w:t>
+      </w:r>
+      <w:r>
+        <w:br/>
+      </w:r>
+      <w:r>
+        <w:rPr>
+          <w:rStyle w:val="NormalTok"/>
+        </w:rPr>
+        <w:t xml:space="preserve">    mid </w:t>
+      </w:r>
+      <w:r>
+        <w:rPr>
+          <w:rStyle w:val="OtherTok"/>
+        </w:rPr>
+        <w:t xml:space="preserve">&lt;-</w:t>
+      </w:r>
+      <w:r>
+        <w:rPr>
+          <w:rStyle w:val="NormalTok"/>
+        </w:rPr>
+        <w:t xml:space="preserve"> draw</w:t>
+      </w:r>
+      <w:r>
+        <w:rPr>
+          <w:rStyle w:val="SpecialCharTok"/>
+        </w:rPr>
+        <w:t xml:space="preserve">$</w:t>
+      </w:r>
+      <w:r>
+        <w:rPr>
+          <w:rStyle w:val="NormalTok"/>
+        </w:rPr>
+        <w:t xml:space="preserve">b_mid_Intercept </w:t>
+      </w:r>
+      <w:r>
+        <w:rPr>
+          <w:rStyle w:val="SpecialCharTok"/>
+        </w:rPr>
+        <w:t xml:space="preserve">+</w:t>
+      </w:r>
+      <w:r>
+        <w:rPr>
+          <w:rStyle w:val="NormalTok"/>
+        </w:rPr>
+        <w:t xml:space="preserve"> draw</w:t>
+      </w:r>
+      <w:r>
+        <w:rPr>
+          <w:rStyle w:val="SpecialCharTok"/>
+        </w:rPr>
+        <w:t xml:space="preserve">$</w:t>
+      </w:r>
+      <w:r>
+        <w:rPr>
+          <w:rStyle w:val="NormalTok"/>
+        </w:rPr>
+        <w:t xml:space="preserve">b_mid_T_c </w:t>
+      </w:r>
+      <w:r>
+        <w:rPr>
+          <w:rStyle w:val="SpecialCharTok"/>
+        </w:rPr>
+        <w:t xml:space="preserve">*</w:t>
+      </w:r>
+      <w:r>
+        <w:rPr>
+          <w:rStyle w:val="NormalTok"/>
+        </w:rPr>
+        <w:t xml:space="preserve"> (T </w:t>
+      </w:r>
+      <w:r>
+        <w:rPr>
+          <w:rStyle w:val="SpecialCharTok"/>
+        </w:rPr>
+        <w:t xml:space="preserve">-</w:t>
+      </w:r>
+      <w:r>
+        <w:rPr>
+          <w:rStyle w:val="NormalTok"/>
+        </w:rPr>
+        <w:t xml:space="preserve"> T_bar)</w:t>
+      </w:r>
+      <w:r>
+        <w:br/>
+      </w:r>
+      <w:r>
+        <w:rPr>
+          <w:rStyle w:val="NormalTok"/>
+        </w:rPr>
+        <w:t xml:space="preserve">    asym_corr </w:t>
+      </w:r>
+      <w:r>
+        <w:rPr>
+          <w:rStyle w:val="OtherTok"/>
+        </w:rPr>
+        <w:t xml:space="preserve">&lt;-</w:t>
+      </w:r>
+      <w:r>
+        <w:rPr>
+          <w:rStyle w:val="NormalTok"/>
+        </w:rPr>
+        <w:t xml:space="preserve"> (</w:t>
+      </w:r>
+      <w:r>
+        <w:rPr>
+          <w:rStyle w:val="DecValTok"/>
+        </w:rPr>
+        <w:t xml:space="preserve">1</w:t>
+      </w:r>
+      <w:r>
+        <w:rPr>
+          <w:rStyle w:val="NormalTok"/>
+        </w:rPr>
+        <w:t xml:space="preserve"> </w:t>
+      </w:r>
+      <w:r>
+        <w:rPr>
+          <w:rStyle w:val="SpecialCharTok"/>
+        </w:rPr>
+        <w:t xml:space="preserve">/</w:t>
+      </w:r>
+      <w:r>
+        <w:rPr>
+          <w:rStyle w:val="NormalTok"/>
+        </w:rPr>
+        <w:t xml:space="preserve"> draw</w:t>
+      </w:r>
+      <w:r>
+        <w:rPr>
+          <w:rStyle w:val="SpecialCharTok"/>
+        </w:rPr>
+        <w:t xml:space="preserve">$</w:t>
+      </w:r>
+      <w:r>
+        <w:rPr>
+          <w:rStyle w:val="NormalTok"/>
+        </w:rPr>
+        <w:t xml:space="preserve">b_k_Intercept) </w:t>
+      </w:r>
+      <w:r>
+        <w:rPr>
+          <w:rStyle w:val="SpecialCharTok"/>
+        </w:rPr>
+        <w:t xml:space="preserve">*</w:t>
+      </w:r>
+      <w:r>
+        <w:br/>
+      </w:r>
+      <w:r>
+        <w:rPr>
+          <w:rStyle w:val="NormalTok"/>
+        </w:rPr>
+        <w:t xml:space="preserve">      </w:t>
+      </w:r>
+      <w:r>
+        <w:rPr>
+          <w:rStyle w:val="FunctionTok"/>
+        </w:rPr>
+        <w:t xml:space="preserve">log</w:t>
+      </w:r>
+      <w:r>
+        <w:rPr>
+          <w:rStyle w:val="NormalTok"/>
+        </w:rPr>
+        <w:t xml:space="preserve">((draw</w:t>
+      </w:r>
+      <w:r>
+        <w:rPr>
+          <w:rStyle w:val="SpecialCharTok"/>
+        </w:rPr>
+        <w:t xml:space="preserve">$</w:t>
+      </w:r>
+      <w:r>
+        <w:rPr>
+          <w:rStyle w:val="NormalTok"/>
+        </w:rPr>
+        <w:t xml:space="preserve">b_u_Intercept </w:t>
+      </w:r>
+      <w:r>
+        <w:rPr>
+          <w:rStyle w:val="SpecialCharTok"/>
+        </w:rPr>
+        <w:t xml:space="preserve">-</w:t>
+      </w:r>
+      <w:r>
+        <w:rPr>
+          <w:rStyle w:val="NormalTok"/>
+        </w:rPr>
+        <w:t xml:space="preserve"> </w:t>
+      </w:r>
+      <w:r>
+        <w:rPr>
+          <w:rStyle w:val="FloatTok"/>
+        </w:rPr>
+        <w:t xml:space="preserve">0.5</w:t>
+      </w:r>
+      <w:r>
+        <w:rPr>
+          <w:rStyle w:val="NormalTok"/>
+        </w:rPr>
+        <w:t xml:space="preserve">) </w:t>
+      </w:r>
+      <w:r>
+        <w:rPr>
+          <w:rStyle w:val="SpecialCharTok"/>
+        </w:rPr>
+        <w:t xml:space="preserve">/</w:t>
+      </w:r>
+      <w:r>
+        <w:rPr>
+          <w:rStyle w:val="NormalTok"/>
+        </w:rPr>
+        <w:t xml:space="preserve"> (</w:t>
+      </w:r>
+      <w:r>
+        <w:rPr>
+          <w:rStyle w:val="FloatTok"/>
+        </w:rPr>
+        <w:t xml:space="preserve">0.5</w:t>
+      </w:r>
+      <w:r>
+        <w:rPr>
+          <w:rStyle w:val="NormalTok"/>
+        </w:rPr>
+        <w:t xml:space="preserve"> </w:t>
+      </w:r>
+      <w:r>
+        <w:rPr>
+          <w:rStyle w:val="SpecialCharTok"/>
+        </w:rPr>
+        <w:t xml:space="preserve">-</w:t>
+      </w:r>
+      <w:r>
+        <w:rPr>
+          <w:rStyle w:val="NormalTok"/>
+        </w:rPr>
+        <w:t xml:space="preserve"> draw</w:t>
+      </w:r>
+      <w:r>
+        <w:rPr>
+          <w:rStyle w:val="SpecialCharTok"/>
+        </w:rPr>
+        <w:t xml:space="preserve">$</w:t>
+      </w:r>
+      <w:r>
+        <w:rPr>
+          <w:rStyle w:val="NormalTok"/>
+        </w:rPr>
+        <w:t xml:space="preserve">b_ell_Intercept))</w:t>
+      </w:r>
+      <w:r>
+        <w:br/>
+      </w:r>
+      <w:r>
+        <w:rPr>
+          <w:rStyle w:val="NormalTok"/>
+        </w:rPr>
+        <w:t xml:space="preserve">    mid </w:t>
+      </w:r>
+      <w:r>
+        <w:rPr>
+          <w:rStyle w:val="SpecialCharTok"/>
+        </w:rPr>
+        <w:t xml:space="preserve">+</w:t>
+      </w:r>
+      <w:r>
+        <w:rPr>
+          <w:rStyle w:val="NormalTok"/>
+        </w:rPr>
+        <w:t xml:space="preserve"> asym_corr</w:t>
+      </w:r>
+      <w:r>
+        <w:br/>
+      </w:r>
+      <w:r>
+        <w:rPr>
+          <w:rStyle w:val="NormalTok"/>
+        </w:rPr>
+        <w:t xml:space="preserve">  }</w:t>
+      </w:r>
+      <w:r>
+        <w:br/>
+      </w:r>
+      <w:r>
+        <w:rPr>
+          <w:rStyle w:val="NormalTok"/>
+        </w:rPr>
+        <w:t xml:space="preserve">}</w:t>
+      </w:r>
+      <w:r>
+        <w:br/>
+      </w:r>
+      <w:r>
+        <w:br/>
+      </w:r>
+      <w:r>
+        <w:rPr>
+          <w:rStyle w:val="CommentTok"/>
+        </w:rPr>
+        <w:t xml:space="preserve"># Take one random posterior draw and apply the recipe.</w:t>
+      </w:r>
+      <w:r>
+        <w:br/>
+      </w:r>
+      <w:r>
+        <w:rPr>
+          <w:rStyle w:val="FunctionTok"/>
+        </w:rPr>
+        <w:t xml:space="preserve">set.seed</w:t>
+      </w:r>
+      <w:r>
+        <w:rPr>
+          <w:rStyle w:val="NormalTok"/>
+        </w:rPr>
+        <w:t xml:space="preserve">(</w:t>
+      </w:r>
+      <w:r>
+        <w:rPr>
+          <w:rStyle w:val="DecValTok"/>
+        </w:rPr>
+        <w:t xml:space="preserve">42</w:t>
+      </w:r>
+      <w:r>
+        <w:rPr>
+          <w:rStyle w:val="NormalTok"/>
+        </w:rPr>
+        <w:t xml:space="preserve">)</w:t>
+      </w:r>
+      <w:r>
+        <w:br/>
+      </w:r>
+      <w:r>
+        <w:rPr>
+          <w:rStyle w:val="NormalTok"/>
+        </w:rPr>
+        <w:t xml:space="preserve">draws_df  </w:t>
+      </w:r>
+      <w:r>
+        <w:rPr>
+          <w:rStyle w:val="OtherTok"/>
+        </w:rPr>
+        <w:t xml:space="preserve">&lt;-</w:t>
+      </w:r>
+      <w:r>
+        <w:rPr>
+          <w:rStyle w:val="NormalTok"/>
+        </w:rPr>
+        <w:t xml:space="preserve"> posterior</w:t>
+      </w:r>
+      <w:r>
+        <w:rPr>
+          <w:rStyle w:val="SpecialCharTok"/>
+        </w:rPr>
+        <w:t xml:space="preserve">::</w:t>
+      </w:r>
+      <w:r>
+        <w:rPr>
+          <w:rStyle w:val="FunctionTok"/>
+        </w:rPr>
+        <w:t xml:space="preserve">as_draws_df</w:t>
+      </w:r>
+      <w:r>
+        <w:rPr>
+          <w:rStyle w:val="NormalTok"/>
+        </w:rPr>
+        <w:t xml:space="preserve">(fit_bin)</w:t>
+      </w:r>
+      <w:r>
+        <w:br/>
+      </w:r>
+      <w:r>
+        <w:rPr>
+          <w:rStyle w:val="NormalTok"/>
+        </w:rPr>
+        <w:t xml:space="preserve">one_draw  </w:t>
+      </w:r>
+      <w:r>
+        <w:rPr>
+          <w:rStyle w:val="OtherTok"/>
+        </w:rPr>
+        <w:t xml:space="preserve">&lt;-</w:t>
+      </w:r>
+      <w:r>
+        <w:rPr>
+          <w:rStyle w:val="NormalTok"/>
+        </w:rPr>
+        <w:t xml:space="preserve"> </w:t>
+      </w:r>
+      <w:r>
+        <w:rPr>
+          <w:rStyle w:val="FunctionTok"/>
+        </w:rPr>
+        <w:t xml:space="preserve">as.list</w:t>
+      </w:r>
+      <w:r>
+        <w:rPr>
+          <w:rStyle w:val="NormalTok"/>
+        </w:rPr>
+        <w:t xml:space="preserve">(draws_df[</w:t>
+      </w:r>
+      <w:r>
+        <w:rPr>
+          <w:rStyle w:val="FunctionTok"/>
+        </w:rPr>
+        <w:t xml:space="preserve">sample.int</w:t>
+      </w:r>
+      <w:r>
+        <w:rPr>
+          <w:rStyle w:val="NormalTok"/>
+        </w:rPr>
+        <w:t xml:space="preserve">(</w:t>
+      </w:r>
+      <w:r>
+        <w:rPr>
+          <w:rStyle w:val="FunctionTok"/>
+        </w:rPr>
+        <w:t xml:space="preserve">nrow</w:t>
+      </w:r>
+      <w:r>
+        <w:rPr>
+          <w:rStyle w:val="NormalTok"/>
+        </w:rPr>
+        <w:t xml:space="preserve">(draws_df), </w:t>
+      </w:r>
+      <w:r>
+        <w:rPr>
+          <w:rStyle w:val="DecValTok"/>
+        </w:rPr>
+        <w:t xml:space="preserve">1</w:t>
+      </w:r>
+      <w:r>
+        <w:rPr>
+          <w:rStyle w:val="NormalTok"/>
+        </w:rPr>
+        <w:t xml:space="preserve">), ])</w:t>
+      </w:r>
+      <w:r>
+        <w:br/>
+      </w:r>
+      <w:r>
+        <w:rPr>
+          <w:rStyle w:val="NormalTok"/>
+        </w:rPr>
+        <w:t xml:space="preserve">fn_linear </w:t>
+      </w:r>
+      <w:r>
+        <w:rPr>
+          <w:rStyle w:val="OtherTok"/>
+        </w:rPr>
+        <w:t xml:space="preserve">&lt;-</w:t>
+      </w:r>
+      <w:r>
+        <w:rPr>
+          <w:rStyle w:val="NormalTok"/>
+        </w:rPr>
+        <w:t xml:space="preserve"> </w:t>
+      </w:r>
+      <w:r>
+        <w:rPr>
+          <w:rStyle w:val="FunctionTok"/>
+        </w:rPr>
+        <w:t xml:space="preserve">log10_lt50_from_draw_linear</w:t>
+      </w:r>
+      <w:r>
+        <w:rPr>
+          <w:rStyle w:val="NormalTok"/>
+        </w:rPr>
+        <w:t xml:space="preserve">(one_draw, </w:t>
+      </w:r>
+      <w:r>
+        <w:rPr>
+          <w:rStyle w:val="AttributeTok"/>
+        </w:rPr>
+        <w:t xml:space="preserve">T_bar =</w:t>
+      </w:r>
+      <w:r>
+        <w:rPr>
+          <w:rStyle w:val="NormalTok"/>
+        </w:rPr>
+        <w:t xml:space="preserve"> true_params</w:t>
+      </w:r>
+      <w:r>
+        <w:rPr>
+          <w:rStyle w:val="SpecialCharTok"/>
+        </w:rPr>
+        <w:t xml:space="preserve">$</w:t>
+      </w:r>
+      <w:r>
+        <w:rPr>
+          <w:rStyle w:val="NormalTok"/>
+        </w:rPr>
+        <w:t xml:space="preserve">T_bar)</w:t>
+      </w:r>
+      <w:r>
+        <w:br/>
+      </w:r>
+      <w:r>
+        <w:br/>
+      </w:r>
+      <w:r>
+        <w:rPr>
+          <w:rStyle w:val="NormalTok"/>
+        </w:rPr>
+        <w:t xml:space="preserve">result </w:t>
+      </w:r>
+      <w:r>
+        <w:rPr>
+          <w:rStyle w:val="OtherTok"/>
+        </w:rPr>
+        <w:t xml:space="preserve">&lt;-</w:t>
+      </w:r>
+      <w:r>
+        <w:rPr>
+          <w:rStyle w:val="NormalTok"/>
+        </w:rPr>
+        <w:t xml:space="preserve"> </w:t>
+      </w:r>
+      <w:r>
+        <w:rPr>
+          <w:rStyle w:val="FunctionTok"/>
+        </w:rPr>
+        <w:t xml:space="preserve">recover_tls_numerical</w:t>
+      </w:r>
+      <w:r>
+        <w:rPr>
+          <w:rStyle w:val="NormalTok"/>
+        </w:rPr>
+        <w:t xml:space="preserve">(</w:t>
+      </w:r>
+      <w:r>
+        <w:br/>
+      </w:r>
+      <w:r>
+        <w:rPr>
+          <w:rStyle w:val="NormalTok"/>
+        </w:rPr>
+        <w:t xml:space="preserve">  fn_linear,</w:t>
+      </w:r>
+      <w:r>
+        <w:br/>
+      </w:r>
+      <w:r>
+        <w:rPr>
+          <w:rStyle w:val="NormalTok"/>
+        </w:rPr>
+        <w:t xml:space="preserve">  </w:t>
+      </w:r>
+      <w:r>
+        <w:rPr>
+          <w:rStyle w:val="AttributeTok"/>
+        </w:rPr>
+        <w:t xml:space="preserve">T_ref     =</w:t>
+      </w:r>
+      <w:r>
+        <w:rPr>
+          <w:rStyle w:val="NormalTok"/>
+        </w:rPr>
+        <w:t xml:space="preserve"> </w:t>
+      </w:r>
+      <w:r>
+        <w:rPr>
+          <w:rStyle w:val="FunctionTok"/>
+        </w:rPr>
+        <w:t xml:space="preserve">c</w:t>
+      </w:r>
+      <w:r>
+        <w:rPr>
+          <w:rStyle w:val="NormalTok"/>
+        </w:rPr>
+        <w:t xml:space="preserve">(</w:t>
+      </w:r>
+      <w:r>
+        <w:rPr>
+          <w:rStyle w:val="DecValTok"/>
+        </w:rPr>
+        <w:t xml:space="preserve">30</w:t>
+      </w:r>
+      <w:r>
+        <w:rPr>
+          <w:rStyle w:val="NormalTok"/>
+        </w:rPr>
+        <w:t xml:space="preserve">, </w:t>
+      </w:r>
+      <w:r>
+        <w:rPr>
+          <w:rStyle w:val="DecValTok"/>
+        </w:rPr>
+        <w:t xml:space="preserve">32</w:t>
+      </w:r>
+      <w:r>
+        <w:rPr>
+          <w:rStyle w:val="NormalTok"/>
+        </w:rPr>
+        <w:t xml:space="preserve">, </w:t>
+      </w:r>
+      <w:r>
+        <w:rPr>
+          <w:rStyle w:val="DecValTok"/>
+        </w:rPr>
+        <w:t xml:space="preserve">34</w:t>
+      </w:r>
+      <w:r>
+        <w:rPr>
+          <w:rStyle w:val="NormalTok"/>
+        </w:rPr>
+        <w:t xml:space="preserve">, </w:t>
+      </w:r>
+      <w:r>
+        <w:rPr>
+          <w:rStyle w:val="DecValTok"/>
+        </w:rPr>
+        <w:t xml:space="preserve">36</w:t>
+      </w:r>
+      <w:r>
+        <w:rPr>
+          <w:rStyle w:val="NormalTok"/>
+        </w:rPr>
+        <w:t xml:space="preserve">, </w:t>
+      </w:r>
+      <w:r>
+        <w:rPr>
+          <w:rStyle w:val="DecValTok"/>
+        </w:rPr>
+        <w:t xml:space="preserve">38</w:t>
+      </w:r>
+      <w:r>
+        <w:rPr>
+          <w:rStyle w:val="NormalTok"/>
+        </w:rPr>
+        <w:t xml:space="preserve">),</w:t>
+      </w:r>
+      <w:r>
+        <w:br/>
+      </w:r>
+      <w:r>
+        <w:rPr>
+          <w:rStyle w:val="NormalTok"/>
+        </w:rPr>
+        <w:t xml:space="preserve">  </w:t>
+      </w:r>
+      <w:r>
+        <w:rPr>
+          <w:rStyle w:val="AttributeTok"/>
+        </w:rPr>
+        <w:t xml:space="preserve">t_ref_min =</w:t>
+      </w:r>
+      <w:r>
+        <w:rPr>
+          <w:rStyle w:val="NormalTok"/>
+        </w:rPr>
+        <w:t xml:space="preserve"> </w:t>
+      </w:r>
+      <w:r>
+        <w:rPr>
+          <w:rStyle w:val="DecValTok"/>
+        </w:rPr>
+        <w:t xml:space="preserve">60</w:t>
+      </w:r>
+      <w:r>
+        <w:rPr>
+          <w:rStyle w:val="NormalTok"/>
+        </w:rPr>
+        <w:t xml:space="preserve">,</w:t>
+      </w:r>
+      <w:r>
+        <w:br/>
+      </w:r>
+      <w:r>
+        <w:rPr>
+          <w:rStyle w:val="NormalTok"/>
+        </w:rPr>
+        <w:t xml:space="preserve">  </w:t>
+      </w:r>
+      <w:r>
+        <w:rPr>
+          <w:rStyle w:val="AttributeTok"/>
+        </w:rPr>
+        <w:t xml:space="preserve">T_search  =</w:t>
+      </w:r>
+      <w:r>
+        <w:rPr>
+          <w:rStyle w:val="NormalTok"/>
+        </w:rPr>
+        <w:t xml:space="preserve"> </w:t>
+      </w:r>
+      <w:r>
+        <w:rPr>
+          <w:rStyle w:val="FunctionTok"/>
+        </w:rPr>
+        <w:t xml:space="preserve">c</w:t>
+      </w:r>
+      <w:r>
+        <w:rPr>
+          <w:rStyle w:val="NormalTok"/>
+        </w:rPr>
+        <w:t xml:space="preserve">(</w:t>
+      </w:r>
+      <w:r>
+        <w:rPr>
+          <w:rStyle w:val="DecValTok"/>
+        </w:rPr>
+        <w:t xml:space="preserve">25</w:t>
+      </w:r>
+      <w:r>
+        <w:rPr>
+          <w:rStyle w:val="NormalTok"/>
+        </w:rPr>
+        <w:t xml:space="preserve">, </w:t>
+      </w:r>
+      <w:r>
+        <w:rPr>
+          <w:rStyle w:val="DecValTok"/>
+        </w:rPr>
+        <w:t xml:space="preserve">45</w:t>
+      </w:r>
+      <w:r>
+        <w:rPr>
+          <w:rStyle w:val="NormalTok"/>
+        </w:rPr>
+        <w:t xml:space="preserve">)</w:t>
+      </w:r>
+      <w:r>
+        <w:br/>
+      </w:r>
+      <w:r>
+        <w:rPr>
+          <w:rStyle w:val="NormalTok"/>
+        </w:rPr>
+        <w:t xml:space="preserve">)</w:t>
+      </w:r>
+      <w:r>
+        <w:br/>
+      </w:r>
+      <w:r>
+        <w:rPr>
+          <w:rStyle w:val="NormalTok"/>
+        </w:rPr>
+        <w:t xml:space="preserve">result</w:t>
+      </w:r>
+    </w:p>
+    <w:p>
+      <w:pPr>
+        <w:pStyle w:val="SourceCode"/>
+      </w:pPr>
+      <w:r>
+        <w:rPr>
+          <w:rStyle w:val="VerbatimChar"/>
+        </w:rPr>
+        <w:t xml:space="preserve">$z_T</w:t>
+      </w:r>
+      <w:r>
+        <w:br/>
+      </w:r>
+      <w:r>
+        <w:rPr>
+          <w:rStyle w:val="VerbatimChar"/>
+        </w:rPr>
+        <w:t xml:space="preserve">      30       32       34       36       38 </w:t>
+      </w:r>
+      <w:r>
+        <w:br/>
+      </w:r>
+      <w:r>
+        <w:rPr>
+          <w:rStyle w:val="VerbatimChar"/>
+        </w:rPr>
+        <w:t xml:space="preserve">6.712102 6.712102 6.712102 6.712102 6.712102 </w:t>
+      </w:r>
+      <w:r>
+        <w:br/>
+      </w:r>
+      <w:r>
+        <w:br/>
+      </w:r>
+      <w:r>
+        <w:rPr>
+          <w:rStyle w:val="VerbatimChar"/>
+        </w:rPr>
+        <w:t xml:space="preserve">$CTmax_1hr</w:t>
+      </w:r>
+      <w:r>
+        <w:br/>
+      </w:r>
+      <w:r>
+        <w:rPr>
+          <w:rStyle w:val="VerbatimChar"/>
+        </w:rPr>
+        <w:t xml:space="preserve">[1] 32.14023</w:t>
+      </w:r>
+    </w:p>
+    <w:p>
+      <w:pPr>
+        <w:pStyle w:val="FirstParagraph"/>
+      </w:pPr>
+      <w:r>
+        <w:t xml:space="preserve">Two things to notice. First,</w:t>
+      </w:r>
+      <w:r>
+        <w:t xml:space="preserve"> </w:t>
+      </w:r>
+      <m:oMath>
+        <m:r>
+          <m:t>z</m:t>
+        </m:r>
+        <m:d>
+          <m:dPr>
+            <m:begChr m:val="("/>
+            <m:sepChr m:val=""/>
+            <m:endChr m:val=")"/>
+            <m:grow/>
+          </m:dPr>
+          <m:e>
+            <m:r>
+              <m:t>T</m:t>
+            </m:r>
+          </m:e>
+        </m:d>
+      </m:oMath>
+      <w:r>
+        <w:t xml:space="preserve"> </w:t>
+      </w:r>
+      <w:r>
+        <w:t xml:space="preserve">is constant across the five reference temperatures — as expected, because</w:t>
+      </w:r>
+      <w:r>
+        <w:t xml:space="preserve"> </w:t>
+      </w:r>
+      <w:r>
+        <w:rPr>
+          <w:rStyle w:val="VerbatimChar"/>
+        </w:rPr>
+        <w:t xml:space="preserve">mid(T)</w:t>
+      </w:r>
+      <w:r>
+        <w:t xml:space="preserve"> </w:t>
+      </w:r>
+      <w:r>
+        <w:t xml:space="preserve">is linear in</w:t>
+      </w:r>
+      <w:r>
+        <w:t xml:space="preserve"> </w:t>
+      </w:r>
+      <m:oMath>
+        <m:r>
+          <m:t>T</m:t>
+        </m:r>
+      </m:oMath>
+      <w:r>
+        <w:t xml:space="preserve"> </w:t>
+      </w:r>
+      <w:r>
+        <w:t xml:space="preserve">for this model, so the local slope is the same everywhere. Second, the recovered</w:t>
+      </w:r>
+      <w:r>
+        <w:t xml:space="preserve"> </w:t>
+      </w:r>
+      <m:oMath>
+        <m:r>
+          <m:t>C</m:t>
+        </m:r>
+        <m:sSub>
+          <m:e>
+            <m:r>
+              <m:t>T</m:t>
+            </m:r>
+          </m:e>
+          <m:sub>
+            <m:r>
+              <m:t>m</m:t>
+            </m:r>
+            <m:r>
+              <m:t>a</m:t>
+            </m:r>
+            <m:sSub>
+              <m:e>
+                <m:r>
+                  <m:t>x</m:t>
+                </m:r>
+              </m:e>
+              <m:sub>
+                <m:r>
+                  <m:t>1</m:t>
+                </m:r>
+                <m:r>
+                  <m:t>h</m:t>
+                </m:r>
+                <m:r>
+                  <m:t>r</m:t>
+                </m:r>
+              </m:sub>
+            </m:sSub>
+          </m:sub>
+        </m:sSub>
+      </m:oMath>
+      <w:r>
+        <w:t xml:space="preserve"> </w:t>
+      </w:r>
+      <w:r>
+        <w:t xml:space="preserve">for this draw matches the closed-form value to within numerical tolerance. This sanity check confirms the recipe; for a fit with smooth or temperature-varying parameters, just swap in a different</w:t>
+      </w:r>
+      <w:r>
+        <w:t xml:space="preserve"> </w:t>
+      </w:r>
+      <w:r>
+        <w:rPr>
+          <w:rStyle w:val="VerbatimChar"/>
+        </w:rPr>
+        <w:t xml:space="preserve">log10_lt50_from_draw_*</w:t>
+      </w:r>
+      <w:r>
+        <w:t xml:space="preserve"> </w:t>
+      </w:r>
+      <w:r>
+        <w:t xml:space="preserve">constructor that respects the new functional form, and run the helper over every posterior draw to get full posteriors of</w:t>
+      </w:r>
+      <w:r>
+        <w:t xml:space="preserve"> </w:t>
+      </w:r>
+      <m:oMath>
+        <m:r>
+          <m:t>z</m:t>
+        </m:r>
+        <m:d>
+          <m:dPr>
+            <m:begChr m:val="("/>
+            <m:sepChr m:val=""/>
+            <m:endChr m:val=")"/>
+            <m:grow/>
+          </m:dPr>
+          <m:e>
+            <m:sSub>
+              <m:e>
+                <m:r>
+                  <m:t>T</m:t>
+                </m:r>
+              </m:e>
+              <m:sub>
+                <m:r>
+                  <m:rPr>
+                    <m:nor/>
+                    <m:sty m:val="p"/>
+                  </m:rPr>
+                  <m:t>ref</m:t>
+                </m:r>
+              </m:sub>
+            </m:sSub>
+          </m:e>
+        </m:d>
+      </m:oMath>
+      <w:r>
+        <w:t xml:space="preserve"> </w:t>
+      </w:r>
+      <w:r>
+        <w:t xml:space="preserve">and</w:t>
+      </w:r>
+      <w:r>
+        <w:t xml:space="preserve"> </w:t>
+      </w:r>
+      <m:oMath>
+        <m:r>
+          <m:t>C</m:t>
+        </m:r>
+        <m:sSub>
+          <m:e>
+            <m:r>
+              <m:t>T</m:t>
+            </m:r>
+          </m:e>
+          <m:sub>
+            <m:r>
+              <m:t>m</m:t>
+            </m:r>
+            <m:r>
+              <m:t>a</m:t>
+            </m:r>
+            <m:sSub>
+              <m:e>
+                <m:r>
+                  <m:t>x</m:t>
+                </m:r>
+              </m:e>
+              <m:sub>
+                <m:r>
+                  <m:t>1</m:t>
+                </m:r>
+                <m:r>
+                  <m:t>h</m:t>
+                </m:r>
+                <m:r>
+                  <m:t>r</m:t>
+                </m:r>
+              </m:sub>
+            </m:sSub>
+          </m:sub>
+        </m:sSub>
+      </m:oMath>
+      <w:r>
+        <w:t xml:space="preserve">.</w:t>
+      </w:r>
+    </w:p>
+    <w:bookmarkEnd w:id="62"/>
+    <w:bookmarkEnd w:id="63"/>
+    <w:bookmarkStart w:id="67" w:name="sec-compare"/>
+    <w:p>
+      <w:pPr>
+        <w:pStyle w:val="Heading3"/>
+      </w:pPr>
+      <w:r>
+        <w:t xml:space="preserve">1.0.6 Comparing the two pipelines</w:t>
+      </w:r>
+    </w:p>
+    <w:bookmarkStart w:id="65" w:name="sec-compare-table"/>
+    <w:p>
+      <w:pPr>
+        <w:pStyle w:val="Heading4"/>
+      </w:pPr>
+      <w:r>
+        <w:t xml:space="preserve">1.0.6.1 Point-estimate agreement on the same data</w:t>
       </w:r>
     </w:p>
     <w:p>
@@ -18899,7 +22772,7 @@
       <w:tr>
         <w:tc>
           <w:tcPr/>
-          <w:bookmarkStart w:id="58" w:name="tbl-twostage-compare"/>
+          <w:bookmarkStart w:id="64" w:name="tbl-twostage-compare"/>
           <w:p>
             <w:pPr>
               <w:jc w:val="center"/>
@@ -19935,7 +23808,7 @@
               </w:tc>
             </w:tr>
           </w:tbl>
-          <w:bookmarkEnd w:id="58"/>
+          <w:bookmarkEnd w:id="64"/>
         </w:tc>
       </w:tr>
     </w:tbl>
@@ -20021,14 +23894,14 @@
         <w:t xml:space="preserve">in disagreement with the field’s existing point estimates, it reproduces them.</w:t>
       </w:r>
     </w:p>
-    <w:bookmarkEnd w:id="59"/>
-    <w:bookmarkStart w:id="60" w:name="sec-compare-why"/>
+    <w:bookmarkEnd w:id="65"/>
+    <w:bookmarkStart w:id="66" w:name="sec-compare-why"/>
     <w:p>
       <w:pPr>
         <w:pStyle w:val="Heading4"/>
       </w:pPr>
       <w:r>
-        <w:t xml:space="preserve">1.0.5.2 Why the joint fit recovers the truth more closely</w:t>
+        <w:t xml:space="preserve">1.0.6.2 Why the joint fit recovers the truth more closely</w:t>
       </w:r>
     </w:p>
     <w:p>
@@ -20280,10 +24153,10 @@
         <w:t xml:space="preserve">). The two-stage’s Stage-1 binomial GLM in its crrent configulation cannot — so per-temperature LT50 estimates are noisier on the beta-binomial dataset than on the binomial one, and that noise propagates into Stage 2. The joint beta-binomial fit removes that noise at its source.</w:t>
       </w:r>
     </w:p>
-    <w:bookmarkEnd w:id="60"/>
-    <w:bookmarkEnd w:id="61"/>
-    <w:bookmarkEnd w:id="62"/>
-    <w:bookmarkStart w:id="68" w:name="references"/>
+    <w:bookmarkEnd w:id="66"/>
+    <w:bookmarkEnd w:id="67"/>
+    <w:bookmarkEnd w:id="68"/>
+    <w:bookmarkStart w:id="74" w:name="references"/>
     <w:p>
       <w:pPr>
         <w:pStyle w:val="Heading1"/>
@@ -20292,8 +24165,8 @@
         <w:t xml:space="preserve">2. References</w:t>
       </w:r>
     </w:p>
-    <w:bookmarkStart w:id="67" w:name="refs"/>
-    <w:bookmarkStart w:id="64" w:name="ref-orsted_finding_2022"/>
+    <w:bookmarkStart w:id="73" w:name="refs"/>
+    <w:bookmarkStart w:id="70" w:name="ref-orsted_finding_2022"/>
     <w:p>
       <w:pPr>
         <w:pStyle w:val="Bibliography"/>
@@ -20304,7 +24177,7 @@
       <w:r>
         <w:t xml:space="preserve"> </w:t>
       </w:r>
-      <w:hyperlink r:id="rId63">
+      <w:hyperlink r:id="rId69">
         <w:r>
           <w:rPr>
             <w:rStyle w:val="Hyperlink"/>
@@ -20347,8 +24220,8 @@
         <w:t xml:space="preserve">, 225, jeb244514.</w:t>
       </w:r>
     </w:p>
-    <w:bookmarkEnd w:id="64"/>
-    <w:bookmarkStart w:id="66" w:name="ref-rezende_landscapes_2014"/>
+    <w:bookmarkEnd w:id="70"/>
+    <w:bookmarkStart w:id="72" w:name="ref-rezende_landscapes_2014"/>
     <w:p>
       <w:pPr>
         <w:pStyle w:val="Bibliography"/>
@@ -20359,7 +24232,7 @@
       <w:r>
         <w:t xml:space="preserve"> </w:t>
       </w:r>
-      <w:hyperlink r:id="rId65">
+      <w:hyperlink r:id="rId71">
         <w:r>
           <w:rPr>
             <w:rStyle w:val="Hyperlink"/>
@@ -20384,10 +24257,10 @@
         <w:t xml:space="preserve">, 28, 799–809.</w:t>
       </w:r>
     </w:p>
-    <w:bookmarkEnd w:id="66"/>
-    <w:bookmarkEnd w:id="67"/>
-    <w:bookmarkEnd w:id="68"/>
-    <w:bookmarkStart w:id="69" w:name="session-information"/>
+    <w:bookmarkEnd w:id="72"/>
+    <w:bookmarkEnd w:id="73"/>
+    <w:bookmarkEnd w:id="74"/>
+    <w:bookmarkStart w:id="75" w:name="session-information"/>
     <w:p>
       <w:pPr>
         <w:pStyle w:val="Heading1"/>
@@ -21962,7 +25835,7 @@
         <w:t xml:space="preserve">pkgconfig(v.2.0.3)</w:t>
       </w:r>
     </w:p>
-    <w:bookmarkEnd w:id="69"/>
+    <w:bookmarkEnd w:id="75"/>
     <w:sectPr>
       <w:pgSz w:h="15840" w:w="12240"/>
       <w:pgMar w:bottom="1440" w:footer="720" w:gutter="0" w:header="720" w:left="1440" w:right="1440" w:top="1440"/>
@@ -22158,10 +26031,176 @@
       </w:pPr>
     </w:lvl>
   </w:abstractNum>
+  <w:abstractNum w:abstractNumId="991">
+    <w:nsid w:val="0000A991"/>
+    <w:multiLevelType w:val="multilevel"/>
+    <w:lvl w:ilvl="0">
+      <w:numFmt w:val="bullet"/>
+      <w:lvlText w:val=""/>
+      <w:lvlJc w:val="left"/>
+      <w:pPr>
+        <w:ind w:left="720" w:hanging="360"/>
+      </w:pPr>
+      <w:rPr>
+        <w:rFonts w:ascii="Symbol" w:hAnsi="Symbol" w:cs="Symbol" w:hint="default"/>
+      </w:rPr>
+    </w:lvl>
+    <w:lvl w:ilvl="1">
+      <w:numFmt w:val="bullet"/>
+      <w:lvlText w:val="o"/>
+      <w:lvlJc w:val="left"/>
+      <w:pPr>
+        <w:ind w:left="1440" w:hanging="360"/>
+      </w:pPr>
+      <w:rPr>
+        <w:rFonts w:ascii="Courier New" w:hAnsi="Courier New" w:cs="Courier New" w:hint="default"/>
+      </w:rPr>
+    </w:lvl>
+    <w:lvl w:ilvl="2">
+      <w:numFmt w:val="bullet"/>
+      <w:lvlText w:val=""/>
+      <w:lvlJc w:val="left"/>
+      <w:pPr>
+        <w:ind w:left="2160" w:hanging="360"/>
+      </w:pPr>
+      <w:rPr>
+        <w:rFonts w:ascii="Wingdings" w:hAnsi="Wingdings" w:cs="Wingdings" w:hint="default"/>
+      </w:rPr>
+    </w:lvl>
+    <w:lvl w:ilvl="3">
+      <w:numFmt w:val="bullet"/>
+      <w:lvlText w:val=""/>
+      <w:lvlJc w:val="left"/>
+      <w:pPr>
+        <w:ind w:left="2880" w:hanging="360"/>
+      </w:pPr>
+      <w:rPr>
+        <w:rFonts w:ascii="Symbol" w:hAnsi="Symbol" w:cs="Symbol" w:hint="default"/>
+      </w:rPr>
+    </w:lvl>
+    <w:lvl w:ilvl="4">
+      <w:numFmt w:val="bullet"/>
+      <w:lvlText w:val="o"/>
+      <w:lvlJc w:val="left"/>
+      <w:pPr>
+        <w:ind w:left="3600" w:hanging="360"/>
+      </w:pPr>
+      <w:rPr>
+        <w:rFonts w:ascii="Courier New" w:hAnsi="Courier New" w:cs="Courier New" w:hint="default"/>
+      </w:rPr>
+    </w:lvl>
+    <w:lvl w:ilvl="5">
+      <w:numFmt w:val="bullet"/>
+      <w:lvlText w:val=""/>
+      <w:lvlJc w:val="left"/>
+      <w:pPr>
+        <w:ind w:left="4320" w:hanging="360"/>
+      </w:pPr>
+      <w:rPr>
+        <w:rFonts w:ascii="Wingdings" w:hAnsi="Wingdings" w:cs="Wingdings" w:hint="default"/>
+      </w:rPr>
+    </w:lvl>
+    <w:lvl w:ilvl="6">
+      <w:numFmt w:val="bullet"/>
+      <w:lvlText w:val=""/>
+      <w:lvlJc w:val="left"/>
+      <w:pPr>
+        <w:ind w:left="5040" w:hanging="360"/>
+      </w:pPr>
+      <w:rPr>
+        <w:rFonts w:ascii="Symbol" w:hAnsi="Symbol" w:cs="Symbol" w:hint="default"/>
+      </w:rPr>
+    </w:lvl>
+    <w:lvl w:ilvl="7">
+      <w:numFmt w:val="bullet"/>
+      <w:lvlText w:val="o"/>
+      <w:lvlJc w:val="left"/>
+      <w:pPr>
+        <w:ind w:left="5760" w:hanging="360"/>
+      </w:pPr>
+      <w:rPr>
+        <w:rFonts w:ascii="Courier New" w:hAnsi="Courier New" w:cs="Courier New" w:hint="default"/>
+      </w:rPr>
+    </w:lvl>
+    <w:lvl w:ilvl="8">
+      <w:numFmt w:val="bullet"/>
+      <w:lvlText w:val=""/>
+      <w:lvlJc w:val="left"/>
+      <w:pPr>
+        <w:ind w:left="6480" w:hanging="360"/>
+      </w:pPr>
+      <w:rPr>
+        <w:rFonts w:ascii="Wingdings" w:hAnsi="Wingdings" w:cs="Wingdings" w:hint="default"/>
+      </w:rPr>
+    </w:lvl>
+  </w:abstractNum>
   <w:num w:numId="1000">
     <w:abstractNumId w:val="990"/>
   </w:num>
   <w:num w:numId="1001">
+    <w:abstractNumId w:val="99411"/>
+    <w:lvlOverride w:ilvl="0">
+      <w:startOverride w:val="1"/>
+    </w:lvlOverride>
+    <w:lvlOverride w:ilvl="1">
+      <w:startOverride w:val="1"/>
+    </w:lvlOverride>
+    <w:lvlOverride w:ilvl="2">
+      <w:startOverride w:val="1"/>
+    </w:lvlOverride>
+    <w:lvlOverride w:ilvl="3">
+      <w:startOverride w:val="1"/>
+    </w:lvlOverride>
+    <w:lvlOverride w:ilvl="4">
+      <w:startOverride w:val="1"/>
+    </w:lvlOverride>
+    <w:lvlOverride w:ilvl="5">
+      <w:startOverride w:val="1"/>
+    </w:lvlOverride>
+    <w:lvlOverride w:ilvl="6">
+      <w:startOverride w:val="1"/>
+    </w:lvlOverride>
+    <w:lvlOverride w:ilvl="7">
+      <w:startOverride w:val="1"/>
+    </w:lvlOverride>
+    <w:lvlOverride w:ilvl="8">
+      <w:startOverride w:val="1"/>
+    </w:lvlOverride>
+  </w:num>
+  <w:num w:numId="1002">
+    <w:abstractNumId w:val="99411"/>
+    <w:lvlOverride w:ilvl="0">
+      <w:startOverride w:val="1"/>
+    </w:lvlOverride>
+    <w:lvlOverride w:ilvl="1">
+      <w:startOverride w:val="1"/>
+    </w:lvlOverride>
+    <w:lvlOverride w:ilvl="2">
+      <w:startOverride w:val="1"/>
+    </w:lvlOverride>
+    <w:lvlOverride w:ilvl="3">
+      <w:startOverride w:val="1"/>
+    </w:lvlOverride>
+    <w:lvlOverride w:ilvl="4">
+      <w:startOverride w:val="1"/>
+    </w:lvlOverride>
+    <w:lvlOverride w:ilvl="5">
+      <w:startOverride w:val="1"/>
+    </w:lvlOverride>
+    <w:lvlOverride w:ilvl="6">
+      <w:startOverride w:val="1"/>
+    </w:lvlOverride>
+    <w:lvlOverride w:ilvl="7">
+      <w:startOverride w:val="1"/>
+    </w:lvlOverride>
+    <w:lvlOverride w:ilvl="8">
+      <w:startOverride w:val="1"/>
+    </w:lvlOverride>
+  </w:num>
+  <w:num w:numId="1003">
+    <w:abstractNumId w:val="991"/>
+  </w:num>
+  <w:num w:numId="1004">
     <w:abstractNumId w:val="99411"/>
     <w:lvlOverride w:ilvl="0">
       <w:startOverride w:val="1"/>

</xml_diff>